<commit_message>
feat: add VIS custom roles settings and password-protected template manager
</commit_message>
<xml_diff>
--- a/public/VIS.docx
+++ b/public/VIS.docx
@@ -751,7 +751,7 @@
           <w:szCs w:val="32"/>
           <w:cs/>
         </w:rPr>
-        <w:t>หัวหน้าฝ่ายบริการศุลกากรที่ 2 (ผ่าน หน.</w:t>
+        <w:t>{{vis_head_service_position}} (ผ่าน หน.</w:t>
       </w:r>
       <w:r>
         <w:rPr>
@@ -1900,25 +1900,25 @@
           <w:szCs w:val="32"/>
           <w:cs/>
         </w:rPr>
-        <w:t xml:space="preserve">       (นายพิภพ พุทธสุข)</w:t>
-      </w:r>
-    </w:p>
-    <w:p>
-      <w:pPr>
-        <w:rPr>
-          <w:rFonts w:ascii="TH SarabunIT๙" w:hAnsi="TH SarabunIT๙" w:cs="TH SarabunIT๙"/>
-          <w:sz w:val="32"/>
-          <w:szCs w:val="32"/>
-        </w:rPr>
-      </w:pPr>
-      <w:r>
-        <w:rPr>
-          <w:rFonts w:ascii="TH SarabunIT๙" w:hAnsi="TH SarabunIT๙" w:cs="TH SarabunIT๙" w:hint="cs"/>
-          <w:sz w:val="32"/>
-          <w:szCs w:val="32"/>
-          <w:cs/>
-        </w:rPr>
-        <w:t xml:space="preserve"> หัวหน้าฝ่ายบริการศุลกากรที่ 2</w:t>
+        <w:t xml:space="preserve">       ({{vis_head_service_name}})</w:t>
+      </w:r>
+    </w:p>
+    <w:p>
+      <w:pPr>
+        <w:rPr>
+          <w:rFonts w:ascii="TH SarabunIT๙" w:hAnsi="TH SarabunIT๙" w:cs="TH SarabunIT๙"/>
+          <w:sz w:val="32"/>
+          <w:szCs w:val="32"/>
+        </w:rPr>
+      </w:pPr>
+      <w:r>
+        <w:rPr>
+          <w:rFonts w:ascii="TH SarabunIT๙" w:hAnsi="TH SarabunIT๙" w:cs="TH SarabunIT๙" w:hint="cs"/>
+          <w:sz w:val="32"/>
+          <w:szCs w:val="32"/>
+          <w:cs/>
+        </w:rPr>
+        <w:t xml:space="preserve"> {{vis_head_service_position}}</w:t>
       </w:r>
     </w:p>
     <w:p>
@@ -3535,7 +3535,7 @@
           <w:szCs w:val="32"/>
           <w:cs/>
         </w:rPr>
-        <w:t>นายสุทิน ภูเดช</w:t>
+        <w:t>{{vis_legal_name}}</w:t>
       </w:r>
       <w:r>
         <w:rPr>
@@ -3616,16 +3616,16 @@
           <w:szCs w:val="32"/>
           <w:cs/>
         </w:rPr>
-        <w:t xml:space="preserve">       นิติกร</w:t>
-      </w:r>
-      <w:r>
-        <w:rPr>
-          <w:rFonts w:ascii="TH SarabunIT๙" w:hAnsi="TH SarabunIT๙" w:cs="TH SarabunIT๙" w:hint="cs"/>
-          <w:sz w:val="32"/>
-          <w:szCs w:val="32"/>
-          <w:cs/>
-        </w:rPr>
-        <w:t>ชำนาญการ</w:t>
+        <w:t xml:space="preserve">       {{vis_legal_position}}</w:t>
+      </w:r>
+      <w:r>
+        <w:rPr>
+          <w:rFonts w:ascii="TH SarabunIT๙" w:hAnsi="TH SarabunIT๙" w:cs="TH SarabunIT๙" w:hint="cs"/>
+          <w:sz w:val="32"/>
+          <w:szCs w:val="32"/>
+          <w:cs/>
+        </w:rPr>
+        <w:t/>
       </w:r>
     </w:p>
     <w:p>
@@ -3689,7 +3689,7 @@
           <w:szCs w:val="32"/>
           <w:cs/>
         </w:rPr>
-        <w:t xml:space="preserve">                 (นายหะริน หอวัง)</w:t>
+        <w:t xml:space="preserve">                 ({{vis_chief_name}})</w:t>
       </w:r>
       <w:r>
         <w:rPr>
@@ -3752,7 +3752,7 @@
           <w:szCs w:val="32"/>
           <w:cs/>
         </w:rPr>
-        <w:t xml:space="preserve">          (นายพิภพ พุทธสุข)</w:t>
+        <w:t xml:space="preserve">          ({{vis_head_service_name}})</w:t>
       </w:r>
     </w:p>
     <w:p>
@@ -3779,25 +3779,25 @@
           <w:szCs w:val="32"/>
           <w:cs/>
         </w:rPr>
-        <w:t xml:space="preserve">นาย{{customs_office}}                              </w:t>
-      </w:r>
-      <w:r>
-        <w:rPr>
-          <w:rFonts w:ascii="TH SarabunIT๙" w:hAnsi="TH SarabunIT๙" w:cs="TH SarabunIT๙" w:hint="cs"/>
-          <w:sz w:val="32"/>
-          <w:szCs w:val="32"/>
-          <w:cs/>
-        </w:rPr>
-        <w:t xml:space="preserve"> </w:t>
-      </w:r>
-      <w:r>
-        <w:rPr>
-          <w:rFonts w:ascii="TH SarabunIT๙" w:hAnsi="TH SarabunIT๙" w:cs="TH SarabunIT๙" w:hint="cs"/>
-          <w:sz w:val="32"/>
-          <w:szCs w:val="32"/>
-          <w:cs/>
-        </w:rPr>
-        <w:t xml:space="preserve">หัวหน้าฝ่ายบริการศุลกากรที่ 2 </w:t>
+        <w:t xml:space="preserve">{{vis_chief_position}}</w:t>
+      </w:r>
+      <w:r>
+        <w:rPr>
+          <w:rFonts w:ascii="TH SarabunIT๙" w:hAnsi="TH SarabunIT๙" w:cs="TH SarabunIT๙" w:hint="cs"/>
+          <w:sz w:val="32"/>
+          <w:szCs w:val="32"/>
+          <w:cs/>
+        </w:rPr>
+        <w:t xml:space="preserve"> </w:t>
+      </w:r>
+      <w:r>
+        <w:rPr>
+          <w:rFonts w:ascii="TH SarabunIT๙" w:hAnsi="TH SarabunIT๙" w:cs="TH SarabunIT๙" w:hint="cs"/>
+          <w:sz w:val="32"/>
+          <w:szCs w:val="32"/>
+          <w:cs/>
+        </w:rPr>
+        <w:t xml:space="preserve">{{vis_head_service_position}} </w:t>
       </w:r>
     </w:p>
     <w:p>
@@ -3906,7 +3906,7 @@
           <w:szCs w:val="32"/>
           <w:cs/>
         </w:rPr>
-        <w:t>นายพิภพ พุทธสุข</w:t>
+        <w:t>{{vis_director_name}}</w:t>
       </w:r>
       <w:r>
         <w:rPr>
@@ -4266,7 +4266,7 @@
           <w:szCs w:val="32"/>
           <w:cs/>
         </w:rPr>
-        <w:t>ผู้อำนวยการส่วนบริการศุลกากร</w:t>
+        <w:t>{{vis_director_position}}</w:t>
       </w:r>
       <w:r>
         <w:rPr>

</xml_diff>

<commit_message>
style(template): update VIS template with VIS2 officer placeholders and strip highlights
</commit_message>
<xml_diff>
--- a/public/VIS.docx
+++ b/public/VIS.docx
@@ -1,6 +1,6 @@
 
 <file path=word/document.xml><?xml version="1.0" encoding="utf-8"?>
-<w:document xmlns:wpc="http://schemas.microsoft.com/office/word/2010/wordprocessingCanvas" xmlns:cx="http://schemas.microsoft.com/office/drawing/2014/chartex" xmlns:mc="http://schemas.openxmlformats.org/markup-compatibility/2006" xmlns:o="urn:schemas-microsoft-com:office:office" xmlns:r="http://schemas.openxmlformats.org/officeDocument/2006/relationships" xmlns:m="http://schemas.openxmlformats.org/officeDocument/2006/math" xmlns:v="urn:schemas-microsoft-com:vml" xmlns:wp14="http://schemas.microsoft.com/office/word/2010/wordprocessingDrawing" xmlns:wp="http://schemas.openxmlformats.org/drawingml/2006/wordprocessingDrawing" xmlns:w10="urn:schemas-microsoft-com:office:word" xmlns:w="http://schemas.openxmlformats.org/wordprocessingml/2006/main" xmlns:w14="http://schemas.microsoft.com/office/word/2010/wordml" xmlns:w15="http://schemas.microsoft.com/office/word/2012/wordml" xmlns:w16se="http://schemas.microsoft.com/office/word/2015/wordml/symex" xmlns:wpg="http://schemas.microsoft.com/office/word/2010/wordprocessingGroup" xmlns:wpi="http://schemas.microsoft.com/office/word/2010/wordprocessingInk" xmlns:wne="http://schemas.microsoft.com/office/word/2006/wordml" xmlns:wps="http://schemas.microsoft.com/office/word/2010/wordprocessingShape" mc:Ignorable="w14 w15 w16se wp14">
+<w:document xmlns:wpc="http://schemas.microsoft.com/office/word/2010/wordprocessingCanvas" xmlns:cx="http://schemas.microsoft.com/office/drawing/2014/chartex" xmlns:cx1="http://schemas.microsoft.com/office/drawing/2015/9/8/chartex" xmlns:cx2="http://schemas.microsoft.com/office/drawing/2015/10/21/chartex" xmlns:cx3="http://schemas.microsoft.com/office/drawing/2016/5/9/chartex" xmlns:cx4="http://schemas.microsoft.com/office/drawing/2016/5/10/chartex" xmlns:cx5="http://schemas.microsoft.com/office/drawing/2016/5/11/chartex" xmlns:cx6="http://schemas.microsoft.com/office/drawing/2016/5/12/chartex" xmlns:cx7="http://schemas.microsoft.com/office/drawing/2016/5/13/chartex" xmlns:cx8="http://schemas.microsoft.com/office/drawing/2016/5/14/chartex" xmlns:mc="http://schemas.openxmlformats.org/markup-compatibility/2006" xmlns:m="http://schemas.openxmlformats.org/officeDocument/2006/math" xmlns:aink="http://schemas.microsoft.com/office/drawing/2016/ink" xmlns:am3d="http://schemas.microsoft.com/office/drawing/2017/model3d" xmlns:oel="http://schemas.microsoft.com/office/2019/extlst" xmlns:r="http://schemas.openxmlformats.org/officeDocument/2006/relationships" xmlns:wp14="http://schemas.microsoft.com/office/word/2010/wordprocessingDrawing" xmlns:wp="http://schemas.openxmlformats.org/drawingml/2006/wordprocessingDrawing" xmlns:wpg="http://schemas.microsoft.com/office/word/2010/wordprocessingGroup" xmlns:wpi="http://schemas.microsoft.com/office/word/2010/wordprocessingInk" xmlns:wps="http://schemas.microsoft.com/office/word/2010/wordprocessingShape" xmlns:o="urn:schemas-microsoft-com:office:office" xmlns:v="urn:schemas-microsoft-com:vml" xmlns:w10="urn:schemas-microsoft-com:office:word" xmlns:w="http://schemas.openxmlformats.org/wordprocessingml/2006/main" xmlns:w14="http://schemas.microsoft.com/office/word/2010/wordml" xmlns:w15="http://schemas.microsoft.com/office/word/2012/wordml" xmlns:w16cex="http://schemas.microsoft.com/office/word/2018/wordml/cex" xmlns:w16cid="http://schemas.microsoft.com/office/word/2016/wordml/cid" xmlns:w16="http://schemas.microsoft.com/office/word/2018/wordml" xmlns:w16sdtdh="http://schemas.microsoft.com/office/word/2020/wordml/sdtdatahash" xmlns:w16sdtfl="http://schemas.microsoft.com/office/word/2024/wordml/sdtformatlock" xmlns:w16se="http://schemas.microsoft.com/office/word/2015/wordml/symex" xmlns:w16du="http://schemas.microsoft.com/office/word/2023/wordml/word16du" xmlns:wne="http://schemas.microsoft.com/office/word/2006/wordml" mc:Ignorable="w14 w15 w16se w16cid w16 w16cex w16sdtdh w16sdtfl w16du wp14">
   <w:body>
     <w:p>
       <w:pPr>
@@ -206,7 +206,7 @@
               </wp:anchor>
             </w:drawing>
           </mc:Choice>
-          <mc:Fallback xmlns:cx1="http://schemas.microsoft.com/office/drawing/2015/9/8/chartex" xmlns:cx2="http://schemas.microsoft.com/office/drawing/2015/10/21/chartex" xmlns:cx3="http://schemas.microsoft.com/office/drawing/2016/5/9/chartex" xmlns:cx4="http://schemas.microsoft.com/office/drawing/2016/5/10/chartex" xmlns:cx5="http://schemas.microsoft.com/office/drawing/2016/5/11/chartex" xmlns:cx6="http://schemas.microsoft.com/office/drawing/2016/5/12/chartex" xmlns:cx7="http://schemas.microsoft.com/office/drawing/2016/5/13/chartex" xmlns:cx8="http://schemas.microsoft.com/office/drawing/2016/5/14/chartex" xmlns:aink="http://schemas.microsoft.com/office/drawing/2016/ink" xmlns:am3d="http://schemas.microsoft.com/office/drawing/2017/model3d" xmlns:w16cid="http://schemas.microsoft.com/office/word/2016/wordml/cid">
+          <mc:Fallback>
             <w:pict>
               <v:line w14:anchorId="43750E2D" id="Line 12" o:spid="_x0000_s1026" style="position:absolute;z-index:251671040;visibility:visible;mso-wrap-style:square;mso-width-percent:0;mso-height-percent:0;mso-wrap-distance-left:9pt;mso-wrap-distance-top:-3e-5mm;mso-wrap-distance-right:9pt;mso-wrap-distance-bottom:-3e-5mm;mso-position-horizontal:absolute;mso-position-horizontal-relative:text;mso-position-vertical:absolute;mso-position-vertical-relative:text;mso-width-percent:0;mso-height-percent:0;mso-width-relative:page;mso-height-relative:page" from="66.5pt,18.95pt" to="452pt,18.95pt" o:gfxdata="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">
                 <v:stroke dashstyle="1 1" endcap="round"/>
@@ -354,7 +354,7 @@
               </wp:anchor>
             </w:drawing>
           </mc:Choice>
-          <mc:Fallback xmlns:cx1="http://schemas.microsoft.com/office/drawing/2015/9/8/chartex" xmlns:cx2="http://schemas.microsoft.com/office/drawing/2015/10/21/chartex" xmlns:cx3="http://schemas.microsoft.com/office/drawing/2016/5/9/chartex" xmlns:cx4="http://schemas.microsoft.com/office/drawing/2016/5/10/chartex" xmlns:cx5="http://schemas.microsoft.com/office/drawing/2016/5/11/chartex" xmlns:cx6="http://schemas.microsoft.com/office/drawing/2016/5/12/chartex" xmlns:cx7="http://schemas.microsoft.com/office/drawing/2016/5/13/chartex" xmlns:cx8="http://schemas.microsoft.com/office/drawing/2016/5/14/chartex" xmlns:aink="http://schemas.microsoft.com/office/drawing/2016/ink" xmlns:am3d="http://schemas.microsoft.com/office/drawing/2017/model3d" xmlns:w16cid="http://schemas.microsoft.com/office/word/2016/wordml/cid">
+          <mc:Fallback>
             <w:pict>
               <v:line w14:anchorId="7D7B79D7" id="Line 14" o:spid="_x0000_s1026" style="position:absolute;z-index:251673088;visibility:visible;mso-wrap-style:square;mso-width-percent:0;mso-height-percent:0;mso-wrap-distance-left:9pt;mso-wrap-distance-top:-3e-5mm;mso-wrap-distance-right:9pt;mso-wrap-distance-bottom:-3e-5mm;mso-position-horizontal:absolute;mso-position-horizontal-relative:text;mso-position-vertical:absolute;mso-position-vertical-relative:text;mso-width-percent:0;mso-height-percent:0;mso-width-relative:page;mso-height-relative:page" from="252pt,19.15pt" to="451.85pt,19.15pt" o:gfxdata="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">
                 <v:stroke dashstyle="1 1" endcap="round"/>
@@ -431,7 +431,7 @@
               </wp:anchor>
             </w:drawing>
           </mc:Choice>
-          <mc:Fallback xmlns:cx1="http://schemas.microsoft.com/office/drawing/2015/9/8/chartex" xmlns:cx2="http://schemas.microsoft.com/office/drawing/2015/10/21/chartex" xmlns:cx3="http://schemas.microsoft.com/office/drawing/2016/5/9/chartex" xmlns:cx4="http://schemas.microsoft.com/office/drawing/2016/5/10/chartex" xmlns:cx5="http://schemas.microsoft.com/office/drawing/2016/5/11/chartex" xmlns:cx6="http://schemas.microsoft.com/office/drawing/2016/5/12/chartex" xmlns:cx7="http://schemas.microsoft.com/office/drawing/2016/5/13/chartex" xmlns:cx8="http://schemas.microsoft.com/office/drawing/2016/5/14/chartex" xmlns:aink="http://schemas.microsoft.com/office/drawing/2016/ink" xmlns:am3d="http://schemas.microsoft.com/office/drawing/2017/model3d" xmlns:w16cid="http://schemas.microsoft.com/office/word/2016/wordml/cid">
+          <mc:Fallback>
             <w:pict>
               <v:line w14:anchorId="7AA3DF05" id="Line 13" o:spid="_x0000_s1026" style="position:absolute;z-index:251672064;visibility:visible;mso-wrap-style:square;mso-width-percent:0;mso-height-percent:0;mso-wrap-distance-left:9pt;mso-wrap-distance-top:-3e-5mm;mso-wrap-distance-right:9pt;mso-wrap-distance-bottom:-3e-5mm;mso-position-horizontal:absolute;mso-position-horizontal-relative:text;mso-position-vertical:absolute;mso-position-vertical-relative:text;mso-width-percent:0;mso-height-percent:0;mso-width-relative:page;mso-height-relative:page" from="9.1pt,19.15pt" to="226.3pt,19.15pt" o:gfxdata="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">
                 <v:stroke dashstyle="1 1" endcap="round"/>
@@ -558,7 +558,25 @@
           <w:sz w:val="32"/>
           <w:szCs w:val="32"/>
         </w:rPr>
-        <w:t>{{doc_date_th}}</w:t>
+        <w:t>{{</w:t>
+      </w:r>
+      <w:proofErr w:type="spellStart"/>
+      <w:r>
+        <w:rPr>
+          <w:rFonts w:ascii="TH SarabunIT๙" w:hAnsi="TH SarabunIT๙" w:cs="TH SarabunIT๙"/>
+          <w:sz w:val="32"/>
+          <w:szCs w:val="32"/>
+        </w:rPr>
+        <w:t>doc_date_th</w:t>
+      </w:r>
+      <w:proofErr w:type="spellEnd"/>
+      <w:r>
+        <w:rPr>
+          <w:rFonts w:ascii="TH SarabunIT๙" w:hAnsi="TH SarabunIT๙" w:cs="TH SarabunIT๙"/>
+          <w:sz w:val="32"/>
+          <w:szCs w:val="32"/>
+        </w:rPr>
+        <w:t>}}</w:t>
       </w:r>
       <w:r>
         <w:rPr>
@@ -659,7 +677,7 @@
               </wp:anchor>
             </w:drawing>
           </mc:Choice>
-          <mc:Fallback xmlns:cx1="http://schemas.microsoft.com/office/drawing/2015/9/8/chartex" xmlns:cx2="http://schemas.microsoft.com/office/drawing/2015/10/21/chartex" xmlns:cx3="http://schemas.microsoft.com/office/drawing/2016/5/9/chartex" xmlns:cx4="http://schemas.microsoft.com/office/drawing/2016/5/10/chartex" xmlns:cx5="http://schemas.microsoft.com/office/drawing/2016/5/11/chartex" xmlns:cx6="http://schemas.microsoft.com/office/drawing/2016/5/12/chartex" xmlns:cx7="http://schemas.microsoft.com/office/drawing/2016/5/13/chartex" xmlns:cx8="http://schemas.microsoft.com/office/drawing/2016/5/14/chartex" xmlns:aink="http://schemas.microsoft.com/office/drawing/2016/ink" xmlns:am3d="http://schemas.microsoft.com/office/drawing/2017/model3d" xmlns:w16cid="http://schemas.microsoft.com/office/word/2016/wordml/cid">
+          <mc:Fallback>
             <w:pict>
               <v:line w14:anchorId="01890A10" id="Line 15" o:spid="_x0000_s1026" style="position:absolute;z-index:251674112;visibility:visible;mso-wrap-style:square;mso-width-percent:0;mso-height-percent:0;mso-wrap-distance-left:9pt;mso-wrap-distance-top:-3e-5mm;mso-wrap-distance-right:9pt;mso-wrap-distance-bottom:-3e-5mm;mso-position-horizontal:absolute;mso-position-horizontal-relative:text;mso-position-vertical:absolute;mso-position-vertical-relative:text;mso-width-percent:0;mso-height-percent:0;mso-width-relative:page;mso-height-relative:page" from="26.25pt,19.3pt" to="451.45pt,19.3pt" o:gfxdata="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">
                 <v:stroke dashstyle="1 1" endcap="round"/>
@@ -703,7 +721,25 @@
           <w:sz w:val="32"/>
           <w:szCs w:val="32"/>
         </w:rPr>
-        <w:t>{{person_name}}</w:t>
+        <w:t>{{</w:t>
+      </w:r>
+      <w:proofErr w:type="spellStart"/>
+      <w:r>
+        <w:rPr>
+          <w:rFonts w:ascii="TH SarabunIT๙" w:hAnsi="TH SarabunIT๙" w:cs="TH SarabunIT๙"/>
+          <w:sz w:val="32"/>
+          <w:szCs w:val="32"/>
+        </w:rPr>
+        <w:t>person_name</w:t>
+      </w:r>
+      <w:proofErr w:type="spellEnd"/>
+      <w:r>
+        <w:rPr>
+          <w:rFonts w:ascii="TH SarabunIT๙" w:hAnsi="TH SarabunIT๙" w:cs="TH SarabunIT๙"/>
+          <w:sz w:val="32"/>
+          <w:szCs w:val="32"/>
+        </w:rPr>
+        <w:t>}}</w:t>
       </w:r>
       <w:r>
         <w:rPr>
@@ -760,7 +796,27 @@
           <w:szCs w:val="32"/>
           <w:cs/>
         </w:rPr>
-        <w:t>{{dept_abbr}}</w:t>
+        <w:t>{{</w:t>
+      </w:r>
+      <w:proofErr w:type="spellStart"/>
+      <w:r>
+        <w:rPr>
+          <w:rFonts w:ascii="TH SarabunIT๙" w:hAnsi="TH SarabunIT๙" w:cs="TH SarabunIT๙" w:hint="cs"/>
+          <w:sz w:val="32"/>
+          <w:szCs w:val="32"/>
+          <w:cs/>
+        </w:rPr>
+        <w:t>dept_abbr</w:t>
+      </w:r>
+      <w:proofErr w:type="spellEnd"/>
+      <w:r>
+        <w:rPr>
+          <w:rFonts w:ascii="TH SarabunIT๙" w:hAnsi="TH SarabunIT๙" w:cs="TH SarabunIT๙" w:hint="cs"/>
+          <w:sz w:val="32"/>
+          <w:szCs w:val="32"/>
+          <w:cs/>
+        </w:rPr>
+        <w:t>}}</w:t>
       </w:r>
       <w:r>
         <w:rPr>
@@ -809,7 +865,27 @@
           <w:szCs w:val="32"/>
           <w:cs/>
         </w:rPr>
-        <w:t>{{doc_date_th}}</w:t>
+        <w:t>{{</w:t>
+      </w:r>
+      <w:proofErr w:type="spellStart"/>
+      <w:r>
+        <w:rPr>
+          <w:rFonts w:ascii="TH SarabunIT๙" w:hAnsi="TH SarabunIT๙" w:cs="TH SarabunIT๙" w:hint="cs"/>
+          <w:sz w:val="32"/>
+          <w:szCs w:val="32"/>
+          <w:cs/>
+        </w:rPr>
+        <w:t>doc_date_th</w:t>
+      </w:r>
+      <w:proofErr w:type="spellEnd"/>
+      <w:r>
+        <w:rPr>
+          <w:rFonts w:ascii="TH SarabunIT๙" w:hAnsi="TH SarabunIT๙" w:cs="TH SarabunIT๙" w:hint="cs"/>
+          <w:sz w:val="32"/>
+          <w:szCs w:val="32"/>
+          <w:cs/>
+        </w:rPr>
+        <w:t>}}</w:t>
       </w:r>
       <w:r>
         <w:rPr>
@@ -826,7 +902,25 @@
           <w:sz w:val="32"/>
           <w:szCs w:val="32"/>
         </w:rPr>
-        <w:t>{{person_name}}</w:t>
+        <w:t>{{</w:t>
+      </w:r>
+      <w:proofErr w:type="spellStart"/>
+      <w:r>
+        <w:rPr>
+          <w:rFonts w:ascii="TH SarabunIT๙" w:hAnsi="TH SarabunIT๙" w:cs="TH SarabunIT๙"/>
+          <w:sz w:val="32"/>
+          <w:szCs w:val="32"/>
+        </w:rPr>
+        <w:t>person_name</w:t>
+      </w:r>
+      <w:proofErr w:type="spellEnd"/>
+      <w:r>
+        <w:rPr>
+          <w:rFonts w:ascii="TH SarabunIT๙" w:hAnsi="TH SarabunIT๙" w:cs="TH SarabunIT๙"/>
+          <w:sz w:val="32"/>
+          <w:szCs w:val="32"/>
+        </w:rPr>
+        <w:t>}}</w:t>
       </w:r>
       <w:r>
         <w:rPr>
@@ -881,14 +975,34 @@
           <w:sz w:val="32"/>
           <w:szCs w:val="32"/>
         </w:rPr>
-        <w:t>{{passport_number}}</w:t>
-      </w:r>
-      <w:r>
-        <w:rPr>
-          <w:rFonts w:ascii="TH SarabunIT๙" w:hAnsi="TH SarabunIT๙" w:cs="TH SarabunIT๙" w:hint="cs"/>
+        <w:t>{{</w:t>
+      </w:r>
+      <w:proofErr w:type="spellStart"/>
+      <w:r>
+        <w:rPr>
+          <w:rFonts w:ascii="TH SarabunIT๙" w:hAnsi="TH SarabunIT๙" w:cs="TH SarabunIT๙"/>
           <w:spacing w:val="-6"/>
           <w:sz w:val="32"/>
           <w:szCs w:val="32"/>
+        </w:rPr>
+        <w:t>passport_number</w:t>
+      </w:r>
+      <w:proofErr w:type="spellEnd"/>
+      <w:r>
+        <w:rPr>
+          <w:rFonts w:ascii="TH SarabunIT๙" w:hAnsi="TH SarabunIT๙" w:cs="TH SarabunIT๙"/>
+          <w:spacing w:val="-6"/>
+          <w:sz w:val="32"/>
+          <w:szCs w:val="32"/>
+        </w:rPr>
+        <w:t>}}</w:t>
+      </w:r>
+      <w:r>
+        <w:rPr>
+          <w:rFonts w:ascii="TH SarabunIT๙" w:hAnsi="TH SarabunIT๙" w:cs="TH SarabunIT๙" w:hint="cs"/>
+          <w:spacing w:val="-6"/>
+          <w:sz w:val="32"/>
+          <w:szCs w:val="32"/>
           <w:cs/>
         </w:rPr>
         <w:t xml:space="preserve"> ได้</w:t>
@@ -911,8 +1025,9 @@
           <w:szCs w:val="32"/>
           <w:cs/>
         </w:rPr>
-        <w:t>{{vehicle_type}}</w:t>
-      </w:r>
+        <w:t>{{</w:t>
+      </w:r>
+      <w:proofErr w:type="spellStart"/>
       <w:r>
         <w:rPr>
           <w:rFonts w:ascii="TH SarabunIT๙" w:hAnsi="TH SarabunIT๙" w:cs="TH SarabunIT๙" w:hint="cs"/>
@@ -921,6 +1036,27 @@
           <w:szCs w:val="32"/>
           <w:cs/>
         </w:rPr>
+        <w:t>vehicle_type</w:t>
+      </w:r>
+      <w:proofErr w:type="spellEnd"/>
+      <w:r>
+        <w:rPr>
+          <w:rFonts w:ascii="TH SarabunIT๙" w:hAnsi="TH SarabunIT๙" w:cs="TH SarabunIT๙" w:hint="cs"/>
+          <w:spacing w:val="-6"/>
+          <w:sz w:val="32"/>
+          <w:szCs w:val="32"/>
+          <w:cs/>
+        </w:rPr>
+        <w:t>}}</w:t>
+      </w:r>
+      <w:r>
+        <w:rPr>
+          <w:rFonts w:ascii="TH SarabunIT๙" w:hAnsi="TH SarabunIT๙" w:cs="TH SarabunIT๙" w:hint="cs"/>
+          <w:spacing w:val="-6"/>
+          <w:sz w:val="32"/>
+          <w:szCs w:val="32"/>
+          <w:cs/>
+        </w:rPr>
         <w:t xml:space="preserve"> ยี่ห้อ </w:t>
       </w:r>
       <w:r>
@@ -930,14 +1066,34 @@
           <w:sz w:val="32"/>
           <w:szCs w:val="32"/>
         </w:rPr>
-        <w:t>{{vehicle_brand}}</w:t>
-      </w:r>
+        <w:t>{{</w:t>
+      </w:r>
+      <w:proofErr w:type="spellStart"/>
       <w:r>
         <w:rPr>
           <w:rFonts w:ascii="TH SarabunIT๙" w:hAnsi="TH SarabunIT๙" w:cs="TH SarabunIT๙"/>
           <w:spacing w:val="-6"/>
           <w:sz w:val="32"/>
           <w:szCs w:val="32"/>
+        </w:rPr>
+        <w:t>vehicle_brand</w:t>
+      </w:r>
+      <w:proofErr w:type="spellEnd"/>
+      <w:r>
+        <w:rPr>
+          <w:rFonts w:ascii="TH SarabunIT๙" w:hAnsi="TH SarabunIT๙" w:cs="TH SarabunIT๙"/>
+          <w:spacing w:val="-6"/>
+          <w:sz w:val="32"/>
+          <w:szCs w:val="32"/>
+        </w:rPr>
+        <w:t>}}</w:t>
+      </w:r>
+      <w:r>
+        <w:rPr>
+          <w:rFonts w:ascii="TH SarabunIT๙" w:hAnsi="TH SarabunIT๙" w:cs="TH SarabunIT๙"/>
+          <w:spacing w:val="-6"/>
+          <w:sz w:val="32"/>
+          <w:szCs w:val="32"/>
           <w:cs/>
         </w:rPr>
         <w:t xml:space="preserve"> </w:t>
@@ -959,7 +1115,27 @@
           <w:sz w:val="32"/>
           <w:szCs w:val="32"/>
         </w:rPr>
-        <w:t>{{vehicle_plate}}</w:t>
+        <w:t>{{</w:t>
+      </w:r>
+      <w:proofErr w:type="spellStart"/>
+      <w:r>
+        <w:rPr>
+          <w:rFonts w:ascii="TH SarabunIT๙" w:hAnsi="TH SarabunIT๙" w:cs="TH SarabunIT๙"/>
+          <w:spacing w:val="-6"/>
+          <w:sz w:val="32"/>
+          <w:szCs w:val="32"/>
+        </w:rPr>
+        <w:t>vehicle_plate</w:t>
+      </w:r>
+      <w:proofErr w:type="spellEnd"/>
+      <w:r>
+        <w:rPr>
+          <w:rFonts w:ascii="TH SarabunIT๙" w:hAnsi="TH SarabunIT๙" w:cs="TH SarabunIT๙"/>
+          <w:spacing w:val="-6"/>
+          <w:sz w:val="32"/>
+          <w:szCs w:val="32"/>
+        </w:rPr>
+        <w:t>}}</w:t>
       </w:r>
       <w:r>
         <w:rPr>
@@ -1003,7 +1179,25 @@
           <w:sz w:val="32"/>
           <w:szCs w:val="32"/>
         </w:rPr>
-        <w:t>{{declaration_number}}</w:t>
+        <w:t>{{</w:t>
+      </w:r>
+      <w:proofErr w:type="spellStart"/>
+      <w:r>
+        <w:rPr>
+          <w:rFonts w:ascii="TH SarabunIT๙" w:hAnsi="TH SarabunIT๙" w:cs="TH SarabunIT๙"/>
+          <w:sz w:val="32"/>
+          <w:szCs w:val="32"/>
+        </w:rPr>
+        <w:t>declaration_number</w:t>
+      </w:r>
+      <w:proofErr w:type="spellEnd"/>
+      <w:r>
+        <w:rPr>
+          <w:rFonts w:ascii="TH SarabunIT๙" w:hAnsi="TH SarabunIT๙" w:cs="TH SarabunIT๙"/>
+          <w:sz w:val="32"/>
+          <w:szCs w:val="32"/>
+        </w:rPr>
+        <w:t>}}</w:t>
       </w:r>
       <w:r>
         <w:rPr>
@@ -1030,7 +1224,27 @@
           <w:szCs w:val="32"/>
           <w:cs/>
         </w:rPr>
-        <w:t>กลับไปนอกราชอาณาจักร ซึ่ง{{vehicle_type}}</w:t>
+        <w:t>กลับไปนอกราชอาณาจักร ซึ่ง{{</w:t>
+      </w:r>
+      <w:proofErr w:type="spellStart"/>
+      <w:r>
+        <w:rPr>
+          <w:rFonts w:ascii="TH SarabunIT๙" w:hAnsi="TH SarabunIT๙" w:cs="TH SarabunIT๙" w:hint="cs"/>
+          <w:sz w:val="32"/>
+          <w:szCs w:val="32"/>
+          <w:cs/>
+        </w:rPr>
+        <w:t>vehicle_type</w:t>
+      </w:r>
+      <w:proofErr w:type="spellEnd"/>
+      <w:r>
+        <w:rPr>
+          <w:rFonts w:ascii="TH SarabunIT๙" w:hAnsi="TH SarabunIT๙" w:cs="TH SarabunIT๙" w:hint="cs"/>
+          <w:sz w:val="32"/>
+          <w:szCs w:val="32"/>
+          <w:cs/>
+        </w:rPr>
+        <w:t>}}</w:t>
       </w:r>
       <w:r>
         <w:rPr>
@@ -1050,8 +1264,9 @@
           <w:szCs w:val="32"/>
           <w:cs/>
         </w:rPr>
-        <w:t>{{import_office}}</w:t>
-      </w:r>
+        <w:t>{{</w:t>
+      </w:r>
+      <w:proofErr w:type="spellStart"/>
       <w:r>
         <w:rPr>
           <w:rFonts w:ascii="TH SarabunIT๙" w:hAnsi="TH SarabunIT๙" w:cs="TH SarabunIT๙" w:hint="cs"/>
@@ -1060,6 +1275,27 @@
           <w:szCs w:val="32"/>
           <w:cs/>
         </w:rPr>
+        <w:t>import_office</w:t>
+      </w:r>
+      <w:proofErr w:type="spellEnd"/>
+      <w:r>
+        <w:rPr>
+          <w:rFonts w:ascii="TH SarabunIT๙" w:hAnsi="TH SarabunIT๙" w:cs="TH SarabunIT๙" w:hint="cs"/>
+          <w:spacing w:val="2"/>
+          <w:sz w:val="32"/>
+          <w:szCs w:val="32"/>
+          <w:cs/>
+        </w:rPr>
+        <w:t>}}</w:t>
+      </w:r>
+      <w:r>
+        <w:rPr>
+          <w:rFonts w:ascii="TH SarabunIT๙" w:hAnsi="TH SarabunIT๙" w:cs="TH SarabunIT๙" w:hint="cs"/>
+          <w:spacing w:val="2"/>
+          <w:sz w:val="32"/>
+          <w:szCs w:val="32"/>
+          <w:cs/>
+        </w:rPr>
         <w:t xml:space="preserve"> เมื่อวันที่</w:t>
       </w:r>
       <w:r>
@@ -1080,8 +1316,9 @@
           <w:szCs w:val="32"/>
           <w:cs/>
         </w:rPr>
-        <w:t>{{import_date_th}}</w:t>
-      </w:r>
+        <w:t>{{</w:t>
+      </w:r>
+      <w:proofErr w:type="spellStart"/>
       <w:r>
         <w:rPr>
           <w:rFonts w:ascii="TH SarabunIT๙" w:hAnsi="TH SarabunIT๙" w:cs="TH SarabunIT๙" w:hint="cs"/>
@@ -1090,6 +1327,27 @@
           <w:szCs w:val="32"/>
           <w:cs/>
         </w:rPr>
+        <w:t>import_date_th</w:t>
+      </w:r>
+      <w:proofErr w:type="spellEnd"/>
+      <w:r>
+        <w:rPr>
+          <w:rFonts w:ascii="TH SarabunIT๙" w:hAnsi="TH SarabunIT๙" w:cs="TH SarabunIT๙" w:hint="cs"/>
+          <w:spacing w:val="-12"/>
+          <w:sz w:val="32"/>
+          <w:szCs w:val="32"/>
+          <w:cs/>
+        </w:rPr>
+        <w:t>}}</w:t>
+      </w:r>
+      <w:r>
+        <w:rPr>
+          <w:rFonts w:ascii="TH SarabunIT๙" w:hAnsi="TH SarabunIT๙" w:cs="TH SarabunIT๙" w:hint="cs"/>
+          <w:spacing w:val="-12"/>
+          <w:sz w:val="32"/>
+          <w:szCs w:val="32"/>
+          <w:cs/>
+        </w:rPr>
         <w:t xml:space="preserve"> และ</w:t>
       </w:r>
       <w:r>
@@ -1135,7 +1393,27 @@
           <w:szCs w:val="32"/>
           <w:cs/>
         </w:rPr>
-        <w:t>{{due_date_th}}</w:t>
+        <w:t>{{</w:t>
+      </w:r>
+      <w:proofErr w:type="spellStart"/>
+      <w:r>
+        <w:rPr>
+          <w:rFonts w:ascii="TH SarabunIT๙" w:hAnsi="TH SarabunIT๙" w:cs="TH SarabunIT๙" w:hint="cs"/>
+          <w:sz w:val="32"/>
+          <w:szCs w:val="32"/>
+          <w:cs/>
+        </w:rPr>
+        <w:t>due_date_th</w:t>
+      </w:r>
+      <w:proofErr w:type="spellEnd"/>
+      <w:r>
+        <w:rPr>
+          <w:rFonts w:ascii="TH SarabunIT๙" w:hAnsi="TH SarabunIT๙" w:cs="TH SarabunIT๙" w:hint="cs"/>
+          <w:sz w:val="32"/>
+          <w:szCs w:val="32"/>
+          <w:cs/>
+        </w:rPr>
+        <w:t>}}</w:t>
       </w:r>
       <w:r>
         <w:rPr>
@@ -1263,14 +1541,34 @@
           <w:sz w:val="32"/>
           <w:szCs w:val="32"/>
         </w:rPr>
-        <w:t>{{person_name}}</w:t>
-      </w:r>
-      <w:r>
-        <w:rPr>
-          <w:rFonts w:ascii="TH SarabunIT๙" w:hAnsi="TH SarabunIT๙" w:cs="TH SarabunIT๙" w:hint="cs"/>
+        <w:t>{{</w:t>
+      </w:r>
+      <w:proofErr w:type="spellStart"/>
+      <w:r>
+        <w:rPr>
+          <w:rFonts w:ascii="TH SarabunIT๙" w:hAnsi="TH SarabunIT๙" w:cs="TH SarabunIT๙"/>
           <w:spacing w:val="-6"/>
           <w:sz w:val="32"/>
           <w:szCs w:val="32"/>
+        </w:rPr>
+        <w:t>person_name</w:t>
+      </w:r>
+      <w:proofErr w:type="spellEnd"/>
+      <w:r>
+        <w:rPr>
+          <w:rFonts w:ascii="TH SarabunIT๙" w:hAnsi="TH SarabunIT๙" w:cs="TH SarabunIT๙"/>
+          <w:spacing w:val="-6"/>
+          <w:sz w:val="32"/>
+          <w:szCs w:val="32"/>
+        </w:rPr>
+        <w:t>}}</w:t>
+      </w:r>
+      <w:r>
+        <w:rPr>
+          <w:rFonts w:ascii="TH SarabunIT๙" w:hAnsi="TH SarabunIT๙" w:cs="TH SarabunIT๙" w:hint="cs"/>
+          <w:spacing w:val="-6"/>
+          <w:sz w:val="32"/>
+          <w:szCs w:val="32"/>
           <w:cs/>
         </w:rPr>
         <w:t xml:space="preserve"> </w:t>
@@ -1283,8 +1581,9 @@
           <w:szCs w:val="32"/>
           <w:cs/>
         </w:rPr>
-        <w:t>ได้นำ{{vehicle_type}}ที่นำ</w:t>
-      </w:r>
+        <w:t>ได้นำ{{</w:t>
+      </w:r>
+      <w:proofErr w:type="spellStart"/>
       <w:r>
         <w:rPr>
           <w:rFonts w:ascii="TH SarabunIT๙" w:hAnsi="TH SarabunIT๙" w:cs="TH SarabunIT๙" w:hint="cs"/>
@@ -1293,6 +1592,27 @@
           <w:szCs w:val="32"/>
           <w:cs/>
         </w:rPr>
+        <w:t>vehicle_type</w:t>
+      </w:r>
+      <w:proofErr w:type="spellEnd"/>
+      <w:r>
+        <w:rPr>
+          <w:rFonts w:ascii="TH SarabunIT๙" w:hAnsi="TH SarabunIT๙" w:cs="TH SarabunIT๙" w:hint="cs"/>
+          <w:spacing w:val="-6"/>
+          <w:sz w:val="32"/>
+          <w:szCs w:val="32"/>
+          <w:cs/>
+        </w:rPr>
+        <w:t>}}ที่นำ</w:t>
+      </w:r>
+      <w:r>
+        <w:rPr>
+          <w:rFonts w:ascii="TH SarabunIT๙" w:hAnsi="TH SarabunIT๙" w:cs="TH SarabunIT๙" w:hint="cs"/>
+          <w:spacing w:val="-6"/>
+          <w:sz w:val="32"/>
+          <w:szCs w:val="32"/>
+          <w:cs/>
+        </w:rPr>
         <w:t>เข้าชั่วคราวตาม ภาค 4</w:t>
       </w:r>
       <w:r>
@@ -1371,7 +1691,29 @@
           <w:szCs w:val="32"/>
           <w:cs/>
         </w:rPr>
-        <w:t>{{doc_date_th}}</w:t>
+        <w:t>{{</w:t>
+      </w:r>
+      <w:proofErr w:type="spellStart"/>
+      <w:r>
+        <w:rPr>
+          <w:rFonts w:ascii="TH SarabunIT๙" w:hAnsi="TH SarabunIT๙" w:cs="TH SarabunIT๙" w:hint="cs"/>
+          <w:spacing w:val="-10"/>
+          <w:sz w:val="32"/>
+          <w:szCs w:val="32"/>
+          <w:cs/>
+        </w:rPr>
+        <w:t>doc_date_th</w:t>
+      </w:r>
+      <w:proofErr w:type="spellEnd"/>
+      <w:r>
+        <w:rPr>
+          <w:rFonts w:ascii="TH SarabunIT๙" w:hAnsi="TH SarabunIT๙" w:cs="TH SarabunIT๙" w:hint="cs"/>
+          <w:spacing w:val="-10"/>
+          <w:sz w:val="32"/>
+          <w:szCs w:val="32"/>
+          <w:cs/>
+        </w:rPr>
+        <w:t>}}</w:t>
       </w:r>
       <w:r>
         <w:rPr>
@@ -1411,7 +1753,29 @@
           <w:szCs w:val="32"/>
           <w:cs/>
         </w:rPr>
-        <w:t>เป็นจำนวน {{fine_days}} วัน</w:t>
+        <w:t>เป็นจำนวน {{</w:t>
+      </w:r>
+      <w:proofErr w:type="spellStart"/>
+      <w:r>
+        <w:rPr>
+          <w:rFonts w:ascii="TH SarabunIT๙" w:hAnsi="TH SarabunIT๙" w:cs="TH SarabunIT๙" w:hint="cs"/>
+          <w:spacing w:val="12"/>
+          <w:sz w:val="32"/>
+          <w:szCs w:val="32"/>
+          <w:cs/>
+        </w:rPr>
+        <w:t>fine_days</w:t>
+      </w:r>
+      <w:proofErr w:type="spellEnd"/>
+      <w:r>
+        <w:rPr>
+          <w:rFonts w:ascii="TH SarabunIT๙" w:hAnsi="TH SarabunIT๙" w:cs="TH SarabunIT๙" w:hint="cs"/>
+          <w:spacing w:val="12"/>
+          <w:sz w:val="32"/>
+          <w:szCs w:val="32"/>
+          <w:cs/>
+        </w:rPr>
+        <w:t>}} วัน</w:t>
       </w:r>
       <w:r>
         <w:rPr>
@@ -1642,7 +2006,27 @@
           <w:szCs w:val="32"/>
           <w:cs/>
         </w:rPr>
-        <w:t>{{proposer_name}}</w:t>
+        <w:t>{{</w:t>
+      </w:r>
+      <w:proofErr w:type="spellStart"/>
+      <w:r>
+        <w:rPr>
+          <w:rFonts w:ascii="TH SarabunIT๙" w:hAnsi="TH SarabunIT๙" w:cs="TH SarabunIT๙" w:hint="cs"/>
+          <w:sz w:val="32"/>
+          <w:szCs w:val="32"/>
+          <w:cs/>
+        </w:rPr>
+        <w:t>proposer_name</w:t>
+      </w:r>
+      <w:proofErr w:type="spellEnd"/>
+      <w:r>
+        <w:rPr>
+          <w:rFonts w:ascii="TH SarabunIT๙" w:hAnsi="TH SarabunIT๙" w:cs="TH SarabunIT๙" w:hint="cs"/>
+          <w:sz w:val="32"/>
+          <w:szCs w:val="32"/>
+          <w:cs/>
+        </w:rPr>
+        <w:t>}}</w:t>
       </w:r>
       <w:r>
         <w:rPr>
@@ -1687,7 +2071,27 @@
           <w:szCs w:val="32"/>
           <w:cs/>
         </w:rPr>
-        <w:t>{{proposer_position}}</w:t>
+        <w:t>{{</w:t>
+      </w:r>
+      <w:proofErr w:type="spellStart"/>
+      <w:r>
+        <w:rPr>
+          <w:rFonts w:ascii="TH SarabunIT๙" w:hAnsi="TH SarabunIT๙" w:cs="TH SarabunIT๙" w:hint="cs"/>
+          <w:sz w:val="32"/>
+          <w:szCs w:val="32"/>
+          <w:cs/>
+        </w:rPr>
+        <w:t>proposer_position</w:t>
+      </w:r>
+      <w:proofErr w:type="spellEnd"/>
+      <w:r>
+        <w:rPr>
+          <w:rFonts w:ascii="TH SarabunIT๙" w:hAnsi="TH SarabunIT๙" w:cs="TH SarabunIT๙" w:hint="cs"/>
+          <w:sz w:val="32"/>
+          <w:szCs w:val="32"/>
+          <w:cs/>
+        </w:rPr>
+        <w:t>}}</w:t>
       </w:r>
     </w:p>
     <w:p>
@@ -1751,7 +2155,27 @@
           <w:szCs w:val="32"/>
           <w:cs/>
         </w:rPr>
-        <w:t>{{approver_name}}</w:t>
+        <w:t>{{</w:t>
+      </w:r>
+      <w:proofErr w:type="spellStart"/>
+      <w:r>
+        <w:rPr>
+          <w:rFonts w:ascii="TH SarabunIT๙" w:hAnsi="TH SarabunIT๙" w:cs="TH SarabunIT๙" w:hint="cs"/>
+          <w:sz w:val="32"/>
+          <w:szCs w:val="32"/>
+          <w:cs/>
+        </w:rPr>
+        <w:t>approver_name</w:t>
+      </w:r>
+      <w:proofErr w:type="spellEnd"/>
+      <w:r>
+        <w:rPr>
+          <w:rFonts w:ascii="TH SarabunIT๙" w:hAnsi="TH SarabunIT๙" w:cs="TH SarabunIT๙" w:hint="cs"/>
+          <w:sz w:val="32"/>
+          <w:szCs w:val="32"/>
+          <w:cs/>
+        </w:rPr>
+        <w:t>}}</w:t>
       </w:r>
       <w:r>
         <w:rPr>
@@ -1787,7 +2211,27 @@
           <w:szCs w:val="32"/>
           <w:cs/>
         </w:rPr>
-        <w:t>{{approver_position}}</w:t>
+        <w:t>{{</w:t>
+      </w:r>
+      <w:proofErr w:type="spellStart"/>
+      <w:r>
+        <w:rPr>
+          <w:rFonts w:ascii="TH SarabunIT๙" w:hAnsi="TH SarabunIT๙" w:cs="TH SarabunIT๙" w:hint="cs"/>
+          <w:sz w:val="32"/>
+          <w:szCs w:val="32"/>
+          <w:cs/>
+        </w:rPr>
+        <w:t>approver_position</w:t>
+      </w:r>
+      <w:proofErr w:type="spellEnd"/>
+      <w:r>
+        <w:rPr>
+          <w:rFonts w:ascii="TH SarabunIT๙" w:hAnsi="TH SarabunIT๙" w:cs="TH SarabunIT๙" w:hint="cs"/>
+          <w:sz w:val="32"/>
+          <w:szCs w:val="32"/>
+          <w:cs/>
+        </w:rPr>
+        <w:t>}}</w:t>
       </w:r>
     </w:p>
     <w:p>
@@ -1900,7 +2344,25 @@
           <w:szCs w:val="32"/>
           <w:cs/>
         </w:rPr>
-        <w:t xml:space="preserve">       ({{vis_head_service_name}})</w:t>
+        <w:t xml:space="preserve">       (</w:t>
+      </w:r>
+      <w:r>
+        <w:rPr>
+          <w:rFonts w:ascii="TH SarabunIT๙" w:hAnsi="TH SarabunIT๙" w:cs="TH SarabunIT๙" w:hint="cs"/>
+          <w:sz w:val="32"/>
+          <w:szCs w:val="32"/>
+          <w:cs/>
+        </w:rPr>
+        <w:t>{{vis_head_service_name}}</w:t>
+      </w:r>
+      <w:r>
+        <w:rPr>
+          <w:rFonts w:ascii="TH SarabunIT๙" w:hAnsi="TH SarabunIT๙" w:cs="TH SarabunIT๙" w:hint="cs"/>
+          <w:sz w:val="32"/>
+          <w:szCs w:val="32"/>
+          <w:cs/>
+        </w:rPr>
+        <w:t>)</w:t>
       </w:r>
     </w:p>
     <w:p>
@@ -1918,7 +2380,16 @@
           <w:szCs w:val="32"/>
           <w:cs/>
         </w:rPr>
-        <w:t xml:space="preserve"> {{vis_head_service_position}}</w:t>
+        <w:t xml:space="preserve"> </w:t>
+      </w:r>
+      <w:r>
+        <w:rPr>
+          <w:rFonts w:ascii="TH SarabunIT๙" w:hAnsi="TH SarabunIT๙" w:cs="TH SarabunIT๙" w:hint="cs"/>
+          <w:sz w:val="32"/>
+          <w:szCs w:val="32"/>
+          <w:cs/>
+        </w:rPr>
+        <w:t>{{vis_head_service_position}}</w:t>
       </w:r>
     </w:p>
     <w:p>
@@ -2218,7 +2689,7 @@
               </wp:anchor>
             </w:drawing>
           </mc:Choice>
-          <mc:Fallback xmlns:cx1="http://schemas.microsoft.com/office/drawing/2015/9/8/chartex" xmlns:cx2="http://schemas.microsoft.com/office/drawing/2015/10/21/chartex" xmlns:cx3="http://schemas.microsoft.com/office/drawing/2016/5/9/chartex" xmlns:cx4="http://schemas.microsoft.com/office/drawing/2016/5/10/chartex" xmlns:cx5="http://schemas.microsoft.com/office/drawing/2016/5/11/chartex" xmlns:cx6="http://schemas.microsoft.com/office/drawing/2016/5/12/chartex" xmlns:cx7="http://schemas.microsoft.com/office/drawing/2016/5/13/chartex" xmlns:cx8="http://schemas.microsoft.com/office/drawing/2016/5/14/chartex" xmlns:aink="http://schemas.microsoft.com/office/drawing/2016/ink" xmlns:am3d="http://schemas.microsoft.com/office/drawing/2017/model3d" xmlns:w16cid="http://schemas.microsoft.com/office/word/2016/wordml/cid">
+          <mc:Fallback>
             <w:pict>
               <v:line w14:anchorId="2C36F0B3" id="Line 12" o:spid="_x0000_s1026" style="position:absolute;z-index:251677184;visibility:visible;mso-wrap-style:square;mso-width-percent:0;mso-height-percent:0;mso-wrap-distance-left:9pt;mso-wrap-distance-top:-3e-5mm;mso-wrap-distance-right:9pt;mso-wrap-distance-bottom:-3e-5mm;mso-position-horizontal:absolute;mso-position-horizontal-relative:text;mso-position-vertical:absolute;mso-position-vertical-relative:text;mso-width-percent:0;mso-height-percent:0;mso-width-relative:page;mso-height-relative:page" from="66.5pt,18.95pt" to="452pt,18.95pt" o:gfxdata="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">
                 <v:stroke dashstyle="1 1" endcap="round"/>
@@ -2366,7 +2837,7 @@
               </wp:anchor>
             </w:drawing>
           </mc:Choice>
-          <mc:Fallback xmlns:cx1="http://schemas.microsoft.com/office/drawing/2015/9/8/chartex" xmlns:cx2="http://schemas.microsoft.com/office/drawing/2015/10/21/chartex" xmlns:cx3="http://schemas.microsoft.com/office/drawing/2016/5/9/chartex" xmlns:cx4="http://schemas.microsoft.com/office/drawing/2016/5/10/chartex" xmlns:cx5="http://schemas.microsoft.com/office/drawing/2016/5/11/chartex" xmlns:cx6="http://schemas.microsoft.com/office/drawing/2016/5/12/chartex" xmlns:cx7="http://schemas.microsoft.com/office/drawing/2016/5/13/chartex" xmlns:cx8="http://schemas.microsoft.com/office/drawing/2016/5/14/chartex" xmlns:aink="http://schemas.microsoft.com/office/drawing/2016/ink" xmlns:am3d="http://schemas.microsoft.com/office/drawing/2017/model3d" xmlns:w16cid="http://schemas.microsoft.com/office/word/2016/wordml/cid">
+          <mc:Fallback>
             <w:pict>
               <v:line w14:anchorId="13B58026" id="Line 14" o:spid="_x0000_s1026" style="position:absolute;z-index:251679232;visibility:visible;mso-wrap-style:square;mso-width-percent:0;mso-height-percent:0;mso-wrap-distance-left:9pt;mso-wrap-distance-top:-3e-5mm;mso-wrap-distance-right:9pt;mso-wrap-distance-bottom:-3e-5mm;mso-position-horizontal:absolute;mso-position-horizontal-relative:text;mso-position-vertical:absolute;mso-position-vertical-relative:text;mso-width-percent:0;mso-height-percent:0;mso-width-relative:page;mso-height-relative:page" from="252pt,19.15pt" to="451.85pt,19.15pt" o:gfxdata="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">
                 <v:stroke dashstyle="1 1" endcap="round"/>
@@ -2443,7 +2914,7 @@
               </wp:anchor>
             </w:drawing>
           </mc:Choice>
-          <mc:Fallback xmlns:cx1="http://schemas.microsoft.com/office/drawing/2015/9/8/chartex" xmlns:cx2="http://schemas.microsoft.com/office/drawing/2015/10/21/chartex" xmlns:cx3="http://schemas.microsoft.com/office/drawing/2016/5/9/chartex" xmlns:cx4="http://schemas.microsoft.com/office/drawing/2016/5/10/chartex" xmlns:cx5="http://schemas.microsoft.com/office/drawing/2016/5/11/chartex" xmlns:cx6="http://schemas.microsoft.com/office/drawing/2016/5/12/chartex" xmlns:cx7="http://schemas.microsoft.com/office/drawing/2016/5/13/chartex" xmlns:cx8="http://schemas.microsoft.com/office/drawing/2016/5/14/chartex" xmlns:aink="http://schemas.microsoft.com/office/drawing/2016/ink" xmlns:am3d="http://schemas.microsoft.com/office/drawing/2017/model3d" xmlns:w16cid="http://schemas.microsoft.com/office/word/2016/wordml/cid">
+          <mc:Fallback>
             <w:pict>
               <v:line w14:anchorId="1E308317" id="Line 13" o:spid="_x0000_s1026" style="position:absolute;z-index:251678208;visibility:visible;mso-wrap-style:square;mso-width-percent:0;mso-height-percent:0;mso-wrap-distance-left:9pt;mso-wrap-distance-top:-3e-5mm;mso-wrap-distance-right:9pt;mso-wrap-distance-bottom:-3e-5mm;mso-position-horizontal:absolute;mso-position-horizontal-relative:text;mso-position-vertical:absolute;mso-position-vertical-relative:text;mso-width-percent:0;mso-height-percent:0;mso-width-relative:page;mso-height-relative:page" from="9.1pt,19.15pt" to="226.3pt,19.15pt" o:gfxdata="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">
                 <v:stroke dashstyle="1 1" endcap="round"/>
@@ -2580,7 +3051,27 @@
           <w:szCs w:val="32"/>
           <w:cs/>
         </w:rPr>
-        <w:t>{{doc_date_th}}</w:t>
+        <w:t>{{</w:t>
+      </w:r>
+      <w:proofErr w:type="spellStart"/>
+      <w:r>
+        <w:rPr>
+          <w:rFonts w:ascii="TH SarabunIT๙" w:hAnsi="TH SarabunIT๙" w:cs="TH SarabunIT๙" w:hint="cs"/>
+          <w:sz w:val="32"/>
+          <w:szCs w:val="32"/>
+          <w:cs/>
+        </w:rPr>
+        <w:t>doc_date_th</w:t>
+      </w:r>
+      <w:proofErr w:type="spellEnd"/>
+      <w:r>
+        <w:rPr>
+          <w:rFonts w:ascii="TH SarabunIT๙" w:hAnsi="TH SarabunIT๙" w:cs="TH SarabunIT๙" w:hint="cs"/>
+          <w:sz w:val="32"/>
+          <w:szCs w:val="32"/>
+          <w:cs/>
+        </w:rPr>
+        <w:t>}}</w:t>
       </w:r>
       <w:r>
         <w:rPr>
@@ -2681,7 +3172,7 @@
               </wp:anchor>
             </w:drawing>
           </mc:Choice>
-          <mc:Fallback xmlns:cx1="http://schemas.microsoft.com/office/drawing/2015/9/8/chartex" xmlns:cx2="http://schemas.microsoft.com/office/drawing/2015/10/21/chartex" xmlns:cx3="http://schemas.microsoft.com/office/drawing/2016/5/9/chartex" xmlns:cx4="http://schemas.microsoft.com/office/drawing/2016/5/10/chartex" xmlns:cx5="http://schemas.microsoft.com/office/drawing/2016/5/11/chartex" xmlns:cx6="http://schemas.microsoft.com/office/drawing/2016/5/12/chartex" xmlns:cx7="http://schemas.microsoft.com/office/drawing/2016/5/13/chartex" xmlns:cx8="http://schemas.microsoft.com/office/drawing/2016/5/14/chartex" xmlns:aink="http://schemas.microsoft.com/office/drawing/2016/ink" xmlns:am3d="http://schemas.microsoft.com/office/drawing/2017/model3d" xmlns:w16cid="http://schemas.microsoft.com/office/word/2016/wordml/cid">
+          <mc:Fallback>
             <w:pict>
               <v:line w14:anchorId="74C31E30" id="Line 15" o:spid="_x0000_s1026" style="position:absolute;z-index:251680256;visibility:visible;mso-wrap-style:square;mso-width-percent:0;mso-height-percent:0;mso-wrap-distance-left:9pt;mso-wrap-distance-top:-3e-5mm;mso-wrap-distance-right:9pt;mso-wrap-distance-bottom:-3e-5mm;mso-position-horizontal:absolute;mso-position-horizontal-relative:text;mso-position-vertical:absolute;mso-position-vertical-relative:text;mso-width-percent:0;mso-height-percent:0;mso-width-relative:page;mso-height-relative:page" from="26.25pt,19.3pt" to="451.45pt,19.3pt" o:gfxdata="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">
                 <v:stroke dashstyle="1 1" endcap="round"/>
@@ -2725,7 +3216,25 @@
           <w:sz w:val="32"/>
           <w:szCs w:val="32"/>
         </w:rPr>
-        <w:t>{{person_name}}</w:t>
+        <w:t>{{</w:t>
+      </w:r>
+      <w:proofErr w:type="spellStart"/>
+      <w:r>
+        <w:rPr>
+          <w:rFonts w:ascii="TH SarabunIT๙" w:hAnsi="TH SarabunIT๙" w:cs="TH SarabunIT๙"/>
+          <w:sz w:val="32"/>
+          <w:szCs w:val="32"/>
+        </w:rPr>
+        <w:t>person_name</w:t>
+      </w:r>
+      <w:proofErr w:type="spellEnd"/>
+      <w:r>
+        <w:rPr>
+          <w:rFonts w:ascii="TH SarabunIT๙" w:hAnsi="TH SarabunIT๙" w:cs="TH SarabunIT๙"/>
+          <w:sz w:val="32"/>
+          <w:szCs w:val="32"/>
+        </w:rPr>
+        <w:t>}}</w:t>
       </w:r>
     </w:p>
     <w:p>
@@ -2765,7 +3274,76 @@
           <w:szCs w:val="32"/>
           <w:cs/>
         </w:rPr>
-        <w:t>นาย{{customs_office}} (ผ่าน ผอ.สบศ. และ หน.ฝบศ.2)</w:t>
+        <w:t>นาย</w:t>
+      </w:r>
+      <w:r>
+        <w:rPr>
+          <w:rFonts w:ascii="TH SarabunIT๙" w:hAnsi="TH SarabunIT๙" w:cs="TH SarabunIT๙" w:hint="cs"/>
+          <w:sz w:val="32"/>
+          <w:szCs w:val="32"/>
+          <w:cs/>
+        </w:rPr>
+        <w:t>ด่านศุลกากรปาดัง</w:t>
+      </w:r>
+      <w:proofErr w:type="spellStart"/>
+      <w:r>
+        <w:rPr>
+          <w:rFonts w:ascii="TH SarabunIT๙" w:hAnsi="TH SarabunIT๙" w:cs="TH SarabunIT๙" w:hint="cs"/>
+          <w:sz w:val="32"/>
+          <w:szCs w:val="32"/>
+          <w:cs/>
+        </w:rPr>
+        <w:t>เบ</w:t>
+      </w:r>
+      <w:proofErr w:type="spellEnd"/>
+      <w:r>
+        <w:rPr>
+          <w:rFonts w:ascii="TH SarabunIT๙" w:hAnsi="TH SarabunIT๙" w:cs="TH SarabunIT๙" w:hint="cs"/>
+          <w:sz w:val="32"/>
+          <w:szCs w:val="32"/>
+          <w:cs/>
+        </w:rPr>
+        <w:t>ซา</w:t>
+      </w:r>
+      <w:proofErr w:type="spellStart"/>
+      <w:r>
+        <w:rPr>
+          <w:rFonts w:ascii="TH SarabunIT๙" w:hAnsi="TH SarabunIT๙" w:cs="TH SarabunIT๙" w:hint="cs"/>
+          <w:sz w:val="32"/>
+          <w:szCs w:val="32"/>
+          <w:cs/>
+        </w:rPr>
+        <w:t>ร์</w:t>
+      </w:r>
+      <w:proofErr w:type="spellEnd"/>
+      <w:r>
+        <w:rPr>
+          <w:rFonts w:ascii="TH SarabunIT๙" w:hAnsi="TH SarabunIT๙" w:cs="TH SarabunIT๙" w:hint="cs"/>
+          <w:sz w:val="32"/>
+          <w:szCs w:val="32"/>
+          <w:cs/>
+        </w:rPr>
+        <w:t xml:space="preserve"> (ผ่าน ผอ.สบศ. และ หน.</w:t>
+      </w:r>
+      <w:proofErr w:type="spellStart"/>
+      <w:r>
+        <w:rPr>
+          <w:rFonts w:ascii="TH SarabunIT๙" w:hAnsi="TH SarabunIT๙" w:cs="TH SarabunIT๙" w:hint="cs"/>
+          <w:sz w:val="32"/>
+          <w:szCs w:val="32"/>
+          <w:cs/>
+        </w:rPr>
+        <w:t>ฝบ</w:t>
+      </w:r>
+      <w:proofErr w:type="spellEnd"/>
+      <w:r>
+        <w:rPr>
+          <w:rFonts w:ascii="TH SarabunIT๙" w:hAnsi="TH SarabunIT๙" w:cs="TH SarabunIT๙" w:hint="cs"/>
+          <w:sz w:val="32"/>
+          <w:szCs w:val="32"/>
+          <w:cs/>
+        </w:rPr>
+        <w:t>ศ.2)</w:t>
       </w:r>
     </w:p>
     <w:p>
@@ -2796,7 +3374,27 @@
           <w:szCs w:val="32"/>
           <w:cs/>
         </w:rPr>
-        <w:t>{{doc_date_th}}</w:t>
+        <w:t>{{</w:t>
+      </w:r>
+      <w:proofErr w:type="spellStart"/>
+      <w:r>
+        <w:rPr>
+          <w:rFonts w:ascii="TH SarabunIT๙" w:hAnsi="TH SarabunIT๙" w:cs="TH SarabunIT๙" w:hint="cs"/>
+          <w:sz w:val="32"/>
+          <w:szCs w:val="32"/>
+          <w:cs/>
+        </w:rPr>
+        <w:t>doc_date_th</w:t>
+      </w:r>
+      <w:proofErr w:type="spellEnd"/>
+      <w:r>
+        <w:rPr>
+          <w:rFonts w:ascii="TH SarabunIT๙" w:hAnsi="TH SarabunIT๙" w:cs="TH SarabunIT๙" w:hint="cs"/>
+          <w:sz w:val="32"/>
+          <w:szCs w:val="32"/>
+          <w:cs/>
+        </w:rPr>
+        <w:t>}}</w:t>
       </w:r>
       <w:r>
         <w:rPr>
@@ -2813,7 +3411,25 @@
           <w:sz w:val="32"/>
           <w:szCs w:val="32"/>
         </w:rPr>
-        <w:t>{{person_name}}</w:t>
+        <w:t>{{</w:t>
+      </w:r>
+      <w:proofErr w:type="spellStart"/>
+      <w:r>
+        <w:rPr>
+          <w:rFonts w:ascii="TH SarabunIT๙" w:hAnsi="TH SarabunIT๙" w:cs="TH SarabunIT๙"/>
+          <w:sz w:val="32"/>
+          <w:szCs w:val="32"/>
+        </w:rPr>
+        <w:t>person_name</w:t>
+      </w:r>
+      <w:proofErr w:type="spellEnd"/>
+      <w:r>
+        <w:rPr>
+          <w:rFonts w:ascii="TH SarabunIT๙" w:hAnsi="TH SarabunIT๙" w:cs="TH SarabunIT๙"/>
+          <w:sz w:val="32"/>
+          <w:szCs w:val="32"/>
+        </w:rPr>
+        <w:t>}}</w:t>
       </w:r>
       <w:r>
         <w:rPr>
@@ -2864,7 +3480,25 @@
           <w:sz w:val="32"/>
           <w:szCs w:val="32"/>
         </w:rPr>
-        <w:t>{{passport_number}}</w:t>
+        <w:t>{{</w:t>
+      </w:r>
+      <w:proofErr w:type="spellStart"/>
+      <w:r>
+        <w:rPr>
+          <w:rFonts w:ascii="TH SarabunIT๙" w:hAnsi="TH SarabunIT๙" w:cs="TH SarabunIT๙"/>
+          <w:sz w:val="32"/>
+          <w:szCs w:val="32"/>
+        </w:rPr>
+        <w:t>passport_number</w:t>
+      </w:r>
+      <w:proofErr w:type="spellEnd"/>
+      <w:r>
+        <w:rPr>
+          <w:rFonts w:ascii="TH SarabunIT๙" w:hAnsi="TH SarabunIT๙" w:cs="TH SarabunIT๙"/>
+          <w:sz w:val="32"/>
+          <w:szCs w:val="32"/>
+        </w:rPr>
+        <w:t>}}</w:t>
       </w:r>
       <w:r>
         <w:rPr>
@@ -2882,7 +3516,27 @@
           <w:szCs w:val="32"/>
           <w:cs/>
         </w:rPr>
-        <w:t>{{declaration_number}}</w:t>
+        <w:t>{{</w:t>
+      </w:r>
+      <w:proofErr w:type="spellStart"/>
+      <w:r>
+        <w:rPr>
+          <w:rFonts w:ascii="TH SarabunIT๙" w:hAnsi="TH SarabunIT๙" w:cs="TH SarabunIT๙" w:hint="cs"/>
+          <w:sz w:val="32"/>
+          <w:szCs w:val="32"/>
+          <w:cs/>
+        </w:rPr>
+        <w:t>declaration_number</w:t>
+      </w:r>
+      <w:proofErr w:type="spellEnd"/>
+      <w:r>
+        <w:rPr>
+          <w:rFonts w:ascii="TH SarabunIT๙" w:hAnsi="TH SarabunIT๙" w:cs="TH SarabunIT๙" w:hint="cs"/>
+          <w:sz w:val="32"/>
+          <w:szCs w:val="32"/>
+          <w:cs/>
+        </w:rPr>
+        <w:t>}}</w:t>
       </w:r>
       <w:r>
         <w:rPr>
@@ -2909,7 +3563,27 @@
           <w:szCs w:val="32"/>
           <w:cs/>
         </w:rPr>
-        <w:t>{{vehicle_type}}</w:t>
+        <w:t>{{</w:t>
+      </w:r>
+      <w:proofErr w:type="spellStart"/>
+      <w:r>
+        <w:rPr>
+          <w:rFonts w:ascii="TH SarabunIT๙" w:hAnsi="TH SarabunIT๙" w:cs="TH SarabunIT๙" w:hint="cs"/>
+          <w:sz w:val="32"/>
+          <w:szCs w:val="32"/>
+          <w:cs/>
+        </w:rPr>
+        <w:t>vehicle_type</w:t>
+      </w:r>
+      <w:proofErr w:type="spellEnd"/>
+      <w:r>
+        <w:rPr>
+          <w:rFonts w:ascii="TH SarabunIT๙" w:hAnsi="TH SarabunIT๙" w:cs="TH SarabunIT๙" w:hint="cs"/>
+          <w:sz w:val="32"/>
+          <w:szCs w:val="32"/>
+          <w:cs/>
+        </w:rPr>
+        <w:t>}}</w:t>
       </w:r>
       <w:r>
         <w:rPr>
@@ -2935,7 +3609,25 @@
           <w:sz w:val="32"/>
           <w:szCs w:val="32"/>
         </w:rPr>
-        <w:t>{{vehicle_brand}}</w:t>
+        <w:t>{{</w:t>
+      </w:r>
+      <w:proofErr w:type="spellStart"/>
+      <w:r>
+        <w:rPr>
+          <w:rFonts w:ascii="TH SarabunIT๙" w:hAnsi="TH SarabunIT๙" w:cs="TH SarabunIT๙"/>
+          <w:sz w:val="32"/>
+          <w:szCs w:val="32"/>
+        </w:rPr>
+        <w:t>vehicle_brand</w:t>
+      </w:r>
+      <w:proofErr w:type="spellEnd"/>
+      <w:r>
+        <w:rPr>
+          <w:rFonts w:ascii="TH SarabunIT๙" w:hAnsi="TH SarabunIT๙" w:cs="TH SarabunIT๙"/>
+          <w:sz w:val="32"/>
+          <w:szCs w:val="32"/>
+        </w:rPr>
+        <w:t>}}</w:t>
       </w:r>
       <w:r>
         <w:rPr>
@@ -2961,7 +3653,25 @@
           <w:sz w:val="32"/>
           <w:szCs w:val="32"/>
         </w:rPr>
-        <w:t>{{vehicle_plate}}</w:t>
+        <w:t>{{</w:t>
+      </w:r>
+      <w:proofErr w:type="spellStart"/>
+      <w:r>
+        <w:rPr>
+          <w:rFonts w:ascii="TH SarabunIT๙" w:hAnsi="TH SarabunIT๙" w:cs="TH SarabunIT๙"/>
+          <w:sz w:val="32"/>
+          <w:szCs w:val="32"/>
+        </w:rPr>
+        <w:t>vehicle_plate</w:t>
+      </w:r>
+      <w:proofErr w:type="spellEnd"/>
+      <w:r>
+        <w:rPr>
+          <w:rFonts w:ascii="TH SarabunIT๙" w:hAnsi="TH SarabunIT๙" w:cs="TH SarabunIT๙"/>
+          <w:sz w:val="32"/>
+          <w:szCs w:val="32"/>
+        </w:rPr>
+        <w:t>}}</w:t>
       </w:r>
       <w:r>
         <w:rPr>
@@ -2979,16 +3689,56 @@
           <w:szCs w:val="32"/>
           <w:cs/>
         </w:rPr>
-        <w:t>กลับไปนอกราชอาณาจักร ซึ่ง{{vehicle_type}}คันดังกล่าวได้นำเข้าทาง</w:t>
-      </w:r>
-      <w:r>
-        <w:rPr>
-          <w:rFonts w:ascii="TH SarabunIT๙" w:hAnsi="TH SarabunIT๙" w:cs="TH SarabunIT๙" w:hint="cs"/>
-          <w:sz w:val="32"/>
-          <w:szCs w:val="32"/>
-          <w:cs/>
-        </w:rPr>
-        <w:t>{{import_office}}</w:t>
+        <w:t>กลับไปนอกราชอาณาจักร ซึ่ง{{</w:t>
+      </w:r>
+      <w:proofErr w:type="spellStart"/>
+      <w:r>
+        <w:rPr>
+          <w:rFonts w:ascii="TH SarabunIT๙" w:hAnsi="TH SarabunIT๙" w:cs="TH SarabunIT๙" w:hint="cs"/>
+          <w:sz w:val="32"/>
+          <w:szCs w:val="32"/>
+          <w:cs/>
+        </w:rPr>
+        <w:t>vehicle_type</w:t>
+      </w:r>
+      <w:proofErr w:type="spellEnd"/>
+      <w:r>
+        <w:rPr>
+          <w:rFonts w:ascii="TH SarabunIT๙" w:hAnsi="TH SarabunIT๙" w:cs="TH SarabunIT๙" w:hint="cs"/>
+          <w:sz w:val="32"/>
+          <w:szCs w:val="32"/>
+          <w:cs/>
+        </w:rPr>
+        <w:t>}}คันดังกล่าวได้นำเข้าทาง</w:t>
+      </w:r>
+      <w:r>
+        <w:rPr>
+          <w:rFonts w:ascii="TH SarabunIT๙" w:hAnsi="TH SarabunIT๙" w:cs="TH SarabunIT๙" w:hint="cs"/>
+          <w:sz w:val="32"/>
+          <w:szCs w:val="32"/>
+          <w:cs/>
+        </w:rPr>
+        <w:t>{{</w:t>
+      </w:r>
+      <w:proofErr w:type="spellStart"/>
+      <w:r>
+        <w:rPr>
+          <w:rFonts w:ascii="TH SarabunIT๙" w:hAnsi="TH SarabunIT๙" w:cs="TH SarabunIT๙" w:hint="cs"/>
+          <w:sz w:val="32"/>
+          <w:szCs w:val="32"/>
+          <w:cs/>
+        </w:rPr>
+        <w:t>import_office</w:t>
+      </w:r>
+      <w:proofErr w:type="spellEnd"/>
+      <w:r>
+        <w:rPr>
+          <w:rFonts w:ascii="TH SarabunIT๙" w:hAnsi="TH SarabunIT๙" w:cs="TH SarabunIT๙" w:hint="cs"/>
+          <w:sz w:val="32"/>
+          <w:szCs w:val="32"/>
+          <w:cs/>
+        </w:rPr>
+        <w:t>}}</w:t>
       </w:r>
       <w:r>
         <w:rPr>
@@ -3007,7 +3757,29 @@
           <w:szCs w:val="32"/>
           <w:cs/>
         </w:rPr>
-        <w:t>{{import_date_th}}</w:t>
+        <w:t>{{</w:t>
+      </w:r>
+      <w:proofErr w:type="spellStart"/>
+      <w:r>
+        <w:rPr>
+          <w:rFonts w:ascii="TH SarabunIT๙" w:hAnsi="TH SarabunIT๙" w:cs="TH SarabunIT๙" w:hint="cs"/>
+          <w:spacing w:val="2"/>
+          <w:sz w:val="32"/>
+          <w:szCs w:val="32"/>
+          <w:cs/>
+        </w:rPr>
+        <w:t>import_date_th</w:t>
+      </w:r>
+      <w:proofErr w:type="spellEnd"/>
+      <w:r>
+        <w:rPr>
+          <w:rFonts w:ascii="TH SarabunIT๙" w:hAnsi="TH SarabunIT๙" w:cs="TH SarabunIT๙" w:hint="cs"/>
+          <w:spacing w:val="2"/>
+          <w:sz w:val="32"/>
+          <w:szCs w:val="32"/>
+          <w:cs/>
+        </w:rPr>
+        <w:t>}}</w:t>
       </w:r>
       <w:r>
         <w:rPr>
@@ -3045,8 +3817,9 @@
           <w:szCs w:val="32"/>
           <w:cs/>
         </w:rPr>
-        <w:t>{{due_date_th}}</w:t>
-      </w:r>
+        <w:t>{{</w:t>
+      </w:r>
+      <w:proofErr w:type="spellStart"/>
       <w:r>
         <w:rPr>
           <w:rFonts w:ascii="TH SarabunIT๙" w:hAnsi="TH SarabunIT๙" w:cs="TH SarabunIT๙" w:hint="cs"/>
@@ -3055,6 +3828,27 @@
           <w:szCs w:val="32"/>
           <w:cs/>
         </w:rPr>
+        <w:t>due_date_th</w:t>
+      </w:r>
+      <w:proofErr w:type="spellEnd"/>
+      <w:r>
+        <w:rPr>
+          <w:rFonts w:ascii="TH SarabunIT๙" w:hAnsi="TH SarabunIT๙" w:cs="TH SarabunIT๙" w:hint="cs"/>
+          <w:spacing w:val="6"/>
+          <w:sz w:val="32"/>
+          <w:szCs w:val="32"/>
+          <w:cs/>
+        </w:rPr>
+        <w:t>}}</w:t>
+      </w:r>
+      <w:r>
+        <w:rPr>
+          <w:rFonts w:ascii="TH SarabunIT๙" w:hAnsi="TH SarabunIT๙" w:cs="TH SarabunIT๙" w:hint="cs"/>
+          <w:spacing w:val="6"/>
+          <w:sz w:val="32"/>
+          <w:szCs w:val="32"/>
+          <w:cs/>
+        </w:rPr>
         <w:t xml:space="preserve"> และฝ่ายควบคุมและตรวจสอบทางศุลกากรพิจารณาแล้วพบว่า การที่</w:t>
       </w:r>
       <w:r>
@@ -3073,7 +3867,25 @@
           <w:sz w:val="32"/>
           <w:szCs w:val="32"/>
         </w:rPr>
-        <w:t>{{person_name}}</w:t>
+        <w:t>{{</w:t>
+      </w:r>
+      <w:proofErr w:type="spellStart"/>
+      <w:r>
+        <w:rPr>
+          <w:rFonts w:ascii="TH SarabunIT๙" w:hAnsi="TH SarabunIT๙" w:cs="TH SarabunIT๙"/>
+          <w:sz w:val="32"/>
+          <w:szCs w:val="32"/>
+        </w:rPr>
+        <w:t>person_name</w:t>
+      </w:r>
+      <w:proofErr w:type="spellEnd"/>
+      <w:r>
+        <w:rPr>
+          <w:rFonts w:ascii="TH SarabunIT๙" w:hAnsi="TH SarabunIT๙" w:cs="TH SarabunIT๙"/>
+          <w:sz w:val="32"/>
+          <w:szCs w:val="32"/>
+        </w:rPr>
+        <w:t>}}</w:t>
       </w:r>
       <w:r>
         <w:rPr>
@@ -3100,7 +3912,27 @@
           <w:szCs w:val="32"/>
           <w:cs/>
         </w:rPr>
-        <w:t>{{vehicle_type}}</w:t>
+        <w:t>{{</w:t>
+      </w:r>
+      <w:proofErr w:type="spellStart"/>
+      <w:r>
+        <w:rPr>
+          <w:rFonts w:ascii="TH SarabunIT๙" w:hAnsi="TH SarabunIT๙" w:cs="TH SarabunIT๙" w:hint="cs"/>
+          <w:sz w:val="32"/>
+          <w:szCs w:val="32"/>
+          <w:cs/>
+        </w:rPr>
+        <w:t>vehicle_type</w:t>
+      </w:r>
+      <w:proofErr w:type="spellEnd"/>
+      <w:r>
+        <w:rPr>
+          <w:rFonts w:ascii="TH SarabunIT๙" w:hAnsi="TH SarabunIT๙" w:cs="TH SarabunIT๙" w:hint="cs"/>
+          <w:sz w:val="32"/>
+          <w:szCs w:val="32"/>
+          <w:cs/>
+        </w:rPr>
+        <w:t>}}</w:t>
       </w:r>
       <w:r>
         <w:rPr>
@@ -3255,7 +4087,27 @@
           <w:szCs w:val="32"/>
           <w:cs/>
         </w:rPr>
-        <w:t>{{vehicle_type}}</w:t>
+        <w:t>{{</w:t>
+      </w:r>
+      <w:proofErr w:type="spellStart"/>
+      <w:r>
+        <w:rPr>
+          <w:rFonts w:ascii="TH SarabunIT๙" w:hAnsi="TH SarabunIT๙" w:cs="TH SarabunIT๙" w:hint="cs"/>
+          <w:sz w:val="32"/>
+          <w:szCs w:val="32"/>
+          <w:cs/>
+        </w:rPr>
+        <w:t>vehicle_type</w:t>
+      </w:r>
+      <w:proofErr w:type="spellEnd"/>
+      <w:r>
+        <w:rPr>
+          <w:rFonts w:ascii="TH SarabunIT๙" w:hAnsi="TH SarabunIT๙" w:cs="TH SarabunIT๙" w:hint="cs"/>
+          <w:sz w:val="32"/>
+          <w:szCs w:val="32"/>
+          <w:cs/>
+        </w:rPr>
+        <w:t>}}</w:t>
       </w:r>
       <w:r>
         <w:rPr>
@@ -3375,7 +4227,29 @@
           <w:u w:val="single"/>
           <w:cs/>
         </w:rPr>
-        <w:t>มเป็นเงินค่าบังคับทัณฑ์บนจำนวน {{fine_amount}} บาท</w:t>
+        <w:t>มเป็นเงินค่าบังคับทัณฑ์บนจำนวน {{</w:t>
+      </w:r>
+      <w:proofErr w:type="spellStart"/>
+      <w:r>
+        <w:rPr>
+          <w:rFonts w:ascii="TH SarabunIT๙" w:hAnsi="TH SarabunIT๙" w:cs="TH SarabunIT๙" w:hint="cs"/>
+          <w:sz w:val="32"/>
+          <w:szCs w:val="32"/>
+          <w:u w:val="single"/>
+          <w:cs/>
+        </w:rPr>
+        <w:t>fine_amount</w:t>
+      </w:r>
+      <w:proofErr w:type="spellEnd"/>
+      <w:r>
+        <w:rPr>
+          <w:rFonts w:ascii="TH SarabunIT๙" w:hAnsi="TH SarabunIT๙" w:cs="TH SarabunIT๙" w:hint="cs"/>
+          <w:sz w:val="32"/>
+          <w:szCs w:val="32"/>
+          <w:u w:val="single"/>
+          <w:cs/>
+        </w:rPr>
+        <w:t>}} บาท</w:t>
       </w:r>
       <w:r>
         <w:rPr>
@@ -3404,7 +4278,29 @@
           <w:szCs w:val="32"/>
           <w:cs/>
         </w:rPr>
-        <w:t>{{dept_abbr}}</w:t>
+        <w:t>{{</w:t>
+      </w:r>
+      <w:proofErr w:type="spellStart"/>
+      <w:r>
+        <w:rPr>
+          <w:rFonts w:ascii="TH SarabunIT๙" w:hAnsi="TH SarabunIT๙" w:cs="TH SarabunIT๙" w:hint="cs"/>
+          <w:spacing w:val="-4"/>
+          <w:sz w:val="32"/>
+          <w:szCs w:val="32"/>
+          <w:cs/>
+        </w:rPr>
+        <w:t>dept_abbr</w:t>
+      </w:r>
+      <w:proofErr w:type="spellEnd"/>
+      <w:r>
+        <w:rPr>
+          <w:rFonts w:ascii="TH SarabunIT๙" w:hAnsi="TH SarabunIT๙" w:cs="TH SarabunIT๙" w:hint="cs"/>
+          <w:spacing w:val="-4"/>
+          <w:sz w:val="32"/>
+          <w:szCs w:val="32"/>
+          <w:cs/>
+        </w:rPr>
+        <w:t>}}</w:t>
       </w:r>
       <w:r>
         <w:rPr>
@@ -3616,7 +4512,16 @@
           <w:szCs w:val="32"/>
           <w:cs/>
         </w:rPr>
-        <w:t xml:space="preserve">       {{vis_legal_position}}</w:t>
+        <w:t xml:space="preserve">       </w:t>
+      </w:r>
+      <w:r>
+        <w:rPr>
+          <w:rFonts w:ascii="TH SarabunIT๙" w:hAnsi="TH SarabunIT๙" w:cs="TH SarabunIT๙" w:hint="cs"/>
+          <w:sz w:val="32"/>
+          <w:szCs w:val="32"/>
+          <w:cs/>
+        </w:rPr>
+        <w:t>{{vis_legal_position}}</w:t>
       </w:r>
       <w:r>
         <w:rPr>
@@ -3689,7 +4594,25 @@
           <w:szCs w:val="32"/>
           <w:cs/>
         </w:rPr>
-        <w:t xml:space="preserve">                 ({{vis_chief_name}})</w:t>
+        <w:t xml:space="preserve">                 (</w:t>
+      </w:r>
+      <w:r>
+        <w:rPr>
+          <w:rFonts w:ascii="TH SarabunIT๙" w:hAnsi="TH SarabunIT๙" w:cs="TH SarabunIT๙" w:hint="cs"/>
+          <w:sz w:val="32"/>
+          <w:szCs w:val="32"/>
+          <w:cs/>
+        </w:rPr>
+        <w:t>{{vis_chief_name}}</w:t>
+      </w:r>
+      <w:r>
+        <w:rPr>
+          <w:rFonts w:ascii="TH SarabunIT๙" w:hAnsi="TH SarabunIT๙" w:cs="TH SarabunIT๙" w:hint="cs"/>
+          <w:sz w:val="32"/>
+          <w:szCs w:val="32"/>
+          <w:cs/>
+        </w:rPr>
+        <w:t>)</w:t>
       </w:r>
       <w:r>
         <w:rPr>
@@ -3752,7 +4675,25 @@
           <w:szCs w:val="32"/>
           <w:cs/>
         </w:rPr>
-        <w:t xml:space="preserve">          ({{vis_head_service_name}})</w:t>
+        <w:t xml:space="preserve">          (</w:t>
+      </w:r>
+      <w:r>
+        <w:rPr>
+          <w:rFonts w:ascii="TH SarabunIT๙" w:hAnsi="TH SarabunIT๙" w:cs="TH SarabunIT๙" w:hint="cs"/>
+          <w:sz w:val="32"/>
+          <w:szCs w:val="32"/>
+          <w:cs/>
+        </w:rPr>
+        <w:t>{{vis_head_service_name}}</w:t>
+      </w:r>
+      <w:r>
+        <w:rPr>
+          <w:rFonts w:ascii="TH SarabunIT๙" w:hAnsi="TH SarabunIT๙" w:cs="TH SarabunIT๙" w:hint="cs"/>
+          <w:sz w:val="32"/>
+          <w:szCs w:val="32"/>
+          <w:cs/>
+        </w:rPr>
+        <w:t>)</w:t>
       </w:r>
     </w:p>
     <w:p>
@@ -3770,16 +4711,65 @@
           <w:szCs w:val="32"/>
           <w:cs/>
         </w:rPr>
-        <w:t xml:space="preserve">            </w:t>
-      </w:r>
-      <w:r>
-        <w:rPr>
-          <w:rFonts w:ascii="TH SarabunIT๙" w:hAnsi="TH SarabunIT๙" w:cs="TH SarabunIT๙" w:hint="cs"/>
-          <w:sz w:val="32"/>
-          <w:szCs w:val="32"/>
-          <w:cs/>
-        </w:rPr>
-        <w:t xml:space="preserve">{{vis_chief_position}}</w:t>
+        <w:t xml:space="preserve">           </w:t>
+      </w:r>
+      <w:r>
+        <w:rPr>
+          <w:rFonts w:ascii="TH SarabunIT๙" w:hAnsi="TH SarabunIT๙" w:cs="TH SarabunIT๙" w:hint="cs"/>
+          <w:sz w:val="32"/>
+          <w:szCs w:val="32"/>
+          <w:cs/>
+        </w:rPr>
+        <w:t>นาย</w:t>
+      </w:r>
+      <w:r>
+        <w:rPr>
+          <w:rFonts w:ascii="TH SarabunIT๙" w:hAnsi="TH SarabunIT๙" w:cs="TH SarabunIT๙" w:hint="cs"/>
+          <w:sz w:val="32"/>
+          <w:szCs w:val="32"/>
+          <w:cs/>
+        </w:rPr>
+        <w:t>{{vis_chief_position}}</w:t>
+      </w:r>
+      <w:proofErr w:type="spellStart"/>
+      <w:r>
+        <w:rPr>
+          <w:rFonts w:ascii="TH SarabunIT๙" w:hAnsi="TH SarabunIT๙" w:cs="TH SarabunIT๙" w:hint="cs"/>
+          <w:sz w:val="32"/>
+          <w:szCs w:val="32"/>
+          <w:cs/>
+        </w:rPr>
+        <w:t/>
+      </w:r>
+      <w:proofErr w:type="spellEnd"/>
+      <w:r>
+        <w:rPr>
+          <w:rFonts w:ascii="TH SarabunIT๙" w:hAnsi="TH SarabunIT๙" w:cs="TH SarabunIT๙" w:hint="cs"/>
+          <w:sz w:val="32"/>
+          <w:szCs w:val="32"/>
+          <w:cs/>
+        </w:rPr>
+        <w:t/>
+      </w:r>
+      <w:proofErr w:type="spellStart"/>
+      <w:r>
+        <w:rPr>
+          <w:rFonts w:ascii="TH SarabunIT๙" w:hAnsi="TH SarabunIT๙" w:cs="TH SarabunIT๙" w:hint="cs"/>
+          <w:sz w:val="32"/>
+          <w:szCs w:val="32"/>
+          <w:cs/>
+        </w:rPr>
+        <w:t/>
+      </w:r>
+      <w:proofErr w:type="spellEnd"/>
+      <w:r>
+        <w:rPr>
+          <w:rFonts w:ascii="TH SarabunIT๙" w:hAnsi="TH SarabunIT๙" w:cs="TH SarabunIT๙" w:hint="cs"/>
+          <w:sz w:val="32"/>
+          <w:szCs w:val="32"/>
+          <w:cs/>
+        </w:rPr>
+        <w:t xml:space="preserve">                              </w:t>
       </w:r>
       <w:r>
         <w:rPr>
@@ -3797,7 +4787,16 @@
           <w:szCs w:val="32"/>
           <w:cs/>
         </w:rPr>
-        <w:t xml:space="preserve">{{vis_head_service_position}} </w:t>
+        <w:t>{{vis_head_service_position}}</w:t>
+      </w:r>
+      <w:r>
+        <w:rPr>
+          <w:rFonts w:ascii="TH SarabunIT๙" w:hAnsi="TH SarabunIT๙" w:cs="TH SarabunIT๙" w:hint="cs"/>
+          <w:sz w:val="32"/>
+          <w:szCs w:val="32"/>
+          <w:cs/>
+        </w:rPr>
+        <w:t xml:space="preserve"> </w:t>
       </w:r>
     </w:p>
     <w:p>
@@ -3906,7 +4905,45 @@
           <w:szCs w:val="32"/>
           <w:cs/>
         </w:rPr>
+        <w:t>นาย</w:t>
+      </w:r>
+      <w:r>
+        <w:rPr>
+          <w:rFonts w:ascii="TH SarabunIT๙" w:hAnsi="TH SarabunIT๙" w:cs="TH SarabunIT๙" w:hint="cs"/>
+          <w:sz w:val="32"/>
+          <w:szCs w:val="32"/>
+          <w:cs/>
+        </w:rPr>
         <w:t>{{vis_director_name}}</w:t>
+      </w:r>
+      <w:proofErr w:type="spellStart"/>
+      <w:r>
+        <w:rPr>
+          <w:rFonts w:ascii="TH SarabunIT๙" w:hAnsi="TH SarabunIT๙" w:cs="TH SarabunIT๙" w:hint="cs"/>
+          <w:sz w:val="32"/>
+          <w:szCs w:val="32"/>
+          <w:cs/>
+        </w:rPr>
+        <w:t/>
+      </w:r>
+      <w:proofErr w:type="spellEnd"/>
+      <w:r>
+        <w:rPr>
+          <w:rFonts w:ascii="TH SarabunIT๙" w:hAnsi="TH SarabunIT๙" w:cs="TH SarabunIT๙" w:hint="cs"/>
+          <w:sz w:val="32"/>
+          <w:szCs w:val="32"/>
+          <w:cs/>
+        </w:rPr>
+        <w:t xml:space="preserve"/>
+      </w:r>
+      <w:r>
+        <w:rPr>
+          <w:rFonts w:ascii="TH SarabunIT๙" w:hAnsi="TH SarabunIT๙" w:cs="TH SarabunIT๙" w:hint="cs"/>
+          <w:sz w:val="32"/>
+          <w:szCs w:val="32"/>
+          <w:cs/>
+        </w:rPr>
+        <w:t/>
       </w:r>
       <w:r>
         <w:rPr>
@@ -3981,7 +5018,7 @@
                           <w:p>
                             <w:pPr>
                               <w:rPr>
-                                <w:rFonts w:ascii="TH SarabunIT๙" w:hAnsi="TH SarabunIT๙" w:cs="TH SarabunIT๙" w:hint="cs"/>
+                                <w:rFonts w:ascii="TH SarabunIT๙" w:hAnsi="TH SarabunIT๙" w:cs="TH SarabunIT๙"/>
                                 <w:sz w:val="22"/>
                                 <w:szCs w:val="24"/>
                                 <w:cs/>
@@ -4015,7 +5052,27 @@
                                 <w:szCs w:val="24"/>
                                 <w:cs/>
                               </w:rPr>
-                              <w:t>คับสัญญาประกันทัณฑ์บน เป็นเงิน {{fine_amount}} บาท (</w:t>
+                              <w:t>คับสัญญาประกันทัณฑ์บน เป็นเงิน {{</w:t>
+                            </w:r>
+                            <w:proofErr w:type="spellStart"/>
+                            <w:r>
+                              <w:rPr>
+                                <w:rFonts w:ascii="TH SarabunIT๙" w:hAnsi="TH SarabunIT๙" w:cs="TH SarabunIT๙" w:hint="cs"/>
+                                <w:sz w:val="22"/>
+                                <w:szCs w:val="24"/>
+                                <w:cs/>
+                              </w:rPr>
+                              <w:t>fine_amount</w:t>
+                            </w:r>
+                            <w:proofErr w:type="spellEnd"/>
+                            <w:r>
+                              <w:rPr>
+                                <w:rFonts w:ascii="TH SarabunIT๙" w:hAnsi="TH SarabunIT๙" w:cs="TH SarabunIT๙" w:hint="cs"/>
+                                <w:sz w:val="22"/>
+                                <w:szCs w:val="24"/>
+                                <w:cs/>
+                              </w:rPr>
+                              <w:t>}} บาท (</w:t>
                             </w:r>
                             <w:r>
                               <w:rPr>
@@ -4024,7 +5081,27 @@
                                 <w:szCs w:val="24"/>
                                 <w:cs/>
                               </w:rPr>
-                              <w:t>{{fine_amount_th}}</w:t>
+                              <w:t>{{</w:t>
+                            </w:r>
+                            <w:proofErr w:type="spellStart"/>
+                            <w:r>
+                              <w:rPr>
+                                <w:rFonts w:ascii="TH SarabunIT๙" w:hAnsi="TH SarabunIT๙" w:cs="TH SarabunIT๙" w:hint="cs"/>
+                                <w:sz w:val="22"/>
+                                <w:szCs w:val="24"/>
+                                <w:cs/>
+                              </w:rPr>
+                              <w:t>fine_amount_th</w:t>
+                            </w:r>
+                            <w:proofErr w:type="spellEnd"/>
+                            <w:r>
+                              <w:rPr>
+                                <w:rFonts w:ascii="TH SarabunIT๙" w:hAnsi="TH SarabunIT๙" w:cs="TH SarabunIT๙" w:hint="cs"/>
+                                <w:sz w:val="22"/>
+                                <w:szCs w:val="24"/>
+                                <w:cs/>
+                              </w:rPr>
+                              <w:t>}}</w:t>
                             </w:r>
                             <w:r>
                               <w:rPr>
@@ -4051,7 +5128,27 @@
                                 <w:szCs w:val="24"/>
                                 <w:cs/>
                               </w:rPr>
-                              <w:t>{{receipt_number}}</w:t>
+                              <w:t>{{</w:t>
+                            </w:r>
+                            <w:proofErr w:type="spellStart"/>
+                            <w:r>
+                              <w:rPr>
+                                <w:rFonts w:ascii="TH SarabunIT๙" w:hAnsi="TH SarabunIT๙" w:cs="TH SarabunIT๙" w:hint="cs"/>
+                                <w:sz w:val="22"/>
+                                <w:szCs w:val="24"/>
+                                <w:cs/>
+                              </w:rPr>
+                              <w:t>receipt_number</w:t>
+                            </w:r>
+                            <w:proofErr w:type="spellEnd"/>
+                            <w:r>
+                              <w:rPr>
+                                <w:rFonts w:ascii="TH SarabunIT๙" w:hAnsi="TH SarabunIT๙" w:cs="TH SarabunIT๙" w:hint="cs"/>
+                                <w:sz w:val="22"/>
+                                <w:szCs w:val="24"/>
+                                <w:cs/>
+                              </w:rPr>
+                              <w:t>}}</w:t>
                             </w:r>
                             <w:r>
                               <w:rPr>
@@ -4078,10 +5175,28 @@
                                 <w:szCs w:val="24"/>
                                 <w:cs/>
                               </w:rPr>
-                              <w:t>{{receipt_date_th}}</w:t>
+                              <w:t>{{</w:t>
                             </w:r>
-                            <w:bookmarkStart w:id="0" w:name="_GoBack"/>
-                            <w:bookmarkEnd w:id="0"/>
+                            <w:proofErr w:type="spellStart"/>
+                            <w:r>
+                              <w:rPr>
+                                <w:rFonts w:ascii="TH SarabunIT๙" w:hAnsi="TH SarabunIT๙" w:cs="TH SarabunIT๙" w:hint="cs"/>
+                                <w:sz w:val="22"/>
+                                <w:szCs w:val="24"/>
+                                <w:cs/>
+                              </w:rPr>
+                              <w:t>receipt_date_th</w:t>
+                            </w:r>
+                            <w:proofErr w:type="spellEnd"/>
+                            <w:r>
+                              <w:rPr>
+                                <w:rFonts w:ascii="TH SarabunIT๙" w:hAnsi="TH SarabunIT๙" w:cs="TH SarabunIT๙" w:hint="cs"/>
+                                <w:sz w:val="22"/>
+                                <w:szCs w:val="24"/>
+                                <w:cs/>
+                              </w:rPr>
+                              <w:t>}}</w:t>
+                            </w:r>
                           </w:p>
                         </w:txbxContent>
                       </wps:txbx>
@@ -4238,26 +5353,16 @@
           <w:szCs w:val="32"/>
           <w:cs/>
         </w:rPr>
-        <w:t xml:space="preserve">                     {{proposer_position}} รักษาการในตำแหน่ง</w:t>
-      </w:r>
-    </w:p>
-    <w:p>
-      <w:pPr>
-        <w:ind w:left="4320" w:firstLine="720"/>
-        <w:rPr>
-          <w:rFonts w:ascii="TH SarabunIT๙" w:hAnsi="TH SarabunIT๙" w:cs="TH SarabunIT๙"/>
-          <w:sz w:val="32"/>
-          <w:szCs w:val="32"/>
-        </w:rPr>
-      </w:pPr>
-      <w:r>
-        <w:rPr>
-          <w:rFonts w:ascii="TH SarabunIT๙" w:hAnsi="TH SarabunIT๙" w:cs="TH SarabunIT๙" w:hint="cs"/>
-          <w:sz w:val="32"/>
-          <w:szCs w:val="32"/>
-          <w:cs/>
-        </w:rPr>
-        <w:t xml:space="preserve">       </w:t>
+        <w:t xml:space="preserve">                    </w:t>
+      </w:r>
+      <w:r>
+        <w:rPr>
+          <w:rFonts w:ascii="TH SarabunIT๙" w:hAnsi="TH SarabunIT๙" w:cs="TH SarabunIT๙" w:hint="cs"/>
+          <w:sz w:val="32"/>
+          <w:szCs w:val="32"/>
+          <w:cs/>
+        </w:rPr>
+        <w:t xml:space="preserve">               </w:t>
       </w:r>
       <w:r>
         <w:rPr>
@@ -4310,7 +5415,7 @@
 </file>
 
 <file path=word/endnotes.xml><?xml version="1.0" encoding="utf-8"?>
-<w:endnotes xmlns:wpc="http://schemas.microsoft.com/office/word/2010/wordprocessingCanvas" xmlns:cx="http://schemas.microsoft.com/office/drawing/2014/chartex" xmlns:mc="http://schemas.openxmlformats.org/markup-compatibility/2006" xmlns:o="urn:schemas-microsoft-com:office:office" xmlns:r="http://schemas.openxmlformats.org/officeDocument/2006/relationships" xmlns:m="http://schemas.openxmlformats.org/officeDocument/2006/math" xmlns:v="urn:schemas-microsoft-com:vml" xmlns:wp14="http://schemas.microsoft.com/office/word/2010/wordprocessingDrawing" xmlns:wp="http://schemas.openxmlformats.org/drawingml/2006/wordprocessingDrawing" xmlns:w10="urn:schemas-microsoft-com:office:word" xmlns:w="http://schemas.openxmlformats.org/wordprocessingml/2006/main" xmlns:w14="http://schemas.microsoft.com/office/word/2010/wordml" xmlns:w15="http://schemas.microsoft.com/office/word/2012/wordml" xmlns:w16se="http://schemas.microsoft.com/office/word/2015/wordml/symex" xmlns:wpg="http://schemas.microsoft.com/office/word/2010/wordprocessingGroup" xmlns:wpi="http://schemas.microsoft.com/office/word/2010/wordprocessingInk" xmlns:wne="http://schemas.microsoft.com/office/word/2006/wordml" xmlns:wps="http://schemas.microsoft.com/office/word/2010/wordprocessingShape" mc:Ignorable="w14 w15 w16se wp14">
+<w:endnotes xmlns:wpc="http://schemas.microsoft.com/office/word/2010/wordprocessingCanvas" xmlns:cx="http://schemas.microsoft.com/office/drawing/2014/chartex" xmlns:cx1="http://schemas.microsoft.com/office/drawing/2015/9/8/chartex" xmlns:cx2="http://schemas.microsoft.com/office/drawing/2015/10/21/chartex" xmlns:cx3="http://schemas.microsoft.com/office/drawing/2016/5/9/chartex" xmlns:cx4="http://schemas.microsoft.com/office/drawing/2016/5/10/chartex" xmlns:cx5="http://schemas.microsoft.com/office/drawing/2016/5/11/chartex" xmlns:cx6="http://schemas.microsoft.com/office/drawing/2016/5/12/chartex" xmlns:cx7="http://schemas.microsoft.com/office/drawing/2016/5/13/chartex" xmlns:cx8="http://schemas.microsoft.com/office/drawing/2016/5/14/chartex" xmlns:mc="http://schemas.openxmlformats.org/markup-compatibility/2006" xmlns:m="http://schemas.openxmlformats.org/officeDocument/2006/math" xmlns:aink="http://schemas.microsoft.com/office/drawing/2016/ink" xmlns:am3d="http://schemas.microsoft.com/office/drawing/2017/model3d" xmlns:oel="http://schemas.microsoft.com/office/2019/extlst" xmlns:r="http://schemas.openxmlformats.org/officeDocument/2006/relationships" xmlns:wp14="http://schemas.microsoft.com/office/word/2010/wordprocessingDrawing" xmlns:wp="http://schemas.openxmlformats.org/drawingml/2006/wordprocessingDrawing" xmlns:wpg="http://schemas.microsoft.com/office/word/2010/wordprocessingGroup" xmlns:wpi="http://schemas.microsoft.com/office/word/2010/wordprocessingInk" xmlns:wps="http://schemas.microsoft.com/office/word/2010/wordprocessingShape" xmlns:o="urn:schemas-microsoft-com:office:office" xmlns:v="urn:schemas-microsoft-com:vml" xmlns:w10="urn:schemas-microsoft-com:office:word" xmlns:w="http://schemas.openxmlformats.org/wordprocessingml/2006/main" xmlns:w14="http://schemas.microsoft.com/office/word/2010/wordml" xmlns:w15="http://schemas.microsoft.com/office/word/2012/wordml" xmlns:w16cex="http://schemas.microsoft.com/office/word/2018/wordml/cex" xmlns:w16cid="http://schemas.microsoft.com/office/word/2016/wordml/cid" xmlns:w16="http://schemas.microsoft.com/office/word/2018/wordml" xmlns:w16sdtdh="http://schemas.microsoft.com/office/word/2020/wordml/sdtdatahash" xmlns:w16sdtfl="http://schemas.microsoft.com/office/word/2024/wordml/sdtformatlock" xmlns:w16se="http://schemas.microsoft.com/office/word/2015/wordml/symex" xmlns:w16du="http://schemas.microsoft.com/office/word/2023/wordml/word16du" xmlns:wne="http://schemas.microsoft.com/office/word/2006/wordml" mc:Ignorable="w14 w15 w16se w16cid w16 w16cex w16sdtdh w16sdtfl w16du wp14">
   <w:endnote w:type="separator" w:id="-1">
     <w:p>
       <w:r>
@@ -4329,7 +5434,7 @@
 </file>
 
 <file path=word/footnotes.xml><?xml version="1.0" encoding="utf-8"?>
-<w:footnotes xmlns:wpc="http://schemas.microsoft.com/office/word/2010/wordprocessingCanvas" xmlns:cx="http://schemas.microsoft.com/office/drawing/2014/chartex" xmlns:mc="http://schemas.openxmlformats.org/markup-compatibility/2006" xmlns:o="urn:schemas-microsoft-com:office:office" xmlns:r="http://schemas.openxmlformats.org/officeDocument/2006/relationships" xmlns:m="http://schemas.openxmlformats.org/officeDocument/2006/math" xmlns:v="urn:schemas-microsoft-com:vml" xmlns:wp14="http://schemas.microsoft.com/office/word/2010/wordprocessingDrawing" xmlns:wp="http://schemas.openxmlformats.org/drawingml/2006/wordprocessingDrawing" xmlns:w10="urn:schemas-microsoft-com:office:word" xmlns:w="http://schemas.openxmlformats.org/wordprocessingml/2006/main" xmlns:w14="http://schemas.microsoft.com/office/word/2010/wordml" xmlns:w15="http://schemas.microsoft.com/office/word/2012/wordml" xmlns:w16se="http://schemas.microsoft.com/office/word/2015/wordml/symex" xmlns:wpg="http://schemas.microsoft.com/office/word/2010/wordprocessingGroup" xmlns:wpi="http://schemas.microsoft.com/office/word/2010/wordprocessingInk" xmlns:wne="http://schemas.microsoft.com/office/word/2006/wordml" xmlns:wps="http://schemas.microsoft.com/office/word/2010/wordprocessingShape" mc:Ignorable="w14 w15 w16se wp14">
+<w:footnotes xmlns:wpc="http://schemas.microsoft.com/office/word/2010/wordprocessingCanvas" xmlns:cx="http://schemas.microsoft.com/office/drawing/2014/chartex" xmlns:cx1="http://schemas.microsoft.com/office/drawing/2015/9/8/chartex" xmlns:cx2="http://schemas.microsoft.com/office/drawing/2015/10/21/chartex" xmlns:cx3="http://schemas.microsoft.com/office/drawing/2016/5/9/chartex" xmlns:cx4="http://schemas.microsoft.com/office/drawing/2016/5/10/chartex" xmlns:cx5="http://schemas.microsoft.com/office/drawing/2016/5/11/chartex" xmlns:cx6="http://schemas.microsoft.com/office/drawing/2016/5/12/chartex" xmlns:cx7="http://schemas.microsoft.com/office/drawing/2016/5/13/chartex" xmlns:cx8="http://schemas.microsoft.com/office/drawing/2016/5/14/chartex" xmlns:mc="http://schemas.openxmlformats.org/markup-compatibility/2006" xmlns:m="http://schemas.openxmlformats.org/officeDocument/2006/math" xmlns:aink="http://schemas.microsoft.com/office/drawing/2016/ink" xmlns:am3d="http://schemas.microsoft.com/office/drawing/2017/model3d" xmlns:oel="http://schemas.microsoft.com/office/2019/extlst" xmlns:r="http://schemas.openxmlformats.org/officeDocument/2006/relationships" xmlns:wp14="http://schemas.microsoft.com/office/word/2010/wordprocessingDrawing" xmlns:wp="http://schemas.openxmlformats.org/drawingml/2006/wordprocessingDrawing" xmlns:wpg="http://schemas.microsoft.com/office/word/2010/wordprocessingGroup" xmlns:wpi="http://schemas.microsoft.com/office/word/2010/wordprocessingInk" xmlns:wps="http://schemas.microsoft.com/office/word/2010/wordprocessingShape" xmlns:o="urn:schemas-microsoft-com:office:office" xmlns:v="urn:schemas-microsoft-com:vml" xmlns:w10="urn:schemas-microsoft-com:office:word" xmlns:w="http://schemas.openxmlformats.org/wordprocessingml/2006/main" xmlns:w14="http://schemas.microsoft.com/office/word/2010/wordml" xmlns:w15="http://schemas.microsoft.com/office/word/2012/wordml" xmlns:w16cex="http://schemas.microsoft.com/office/word/2018/wordml/cex" xmlns:w16cid="http://schemas.microsoft.com/office/word/2016/wordml/cid" xmlns:w16="http://schemas.microsoft.com/office/word/2018/wordml" xmlns:w16sdtdh="http://schemas.microsoft.com/office/word/2020/wordml/sdtdatahash" xmlns:w16sdtfl="http://schemas.microsoft.com/office/word/2024/wordml/sdtformatlock" xmlns:w16se="http://schemas.microsoft.com/office/word/2015/wordml/symex" xmlns:w16du="http://schemas.microsoft.com/office/word/2023/wordml/word16du" xmlns:wne="http://schemas.microsoft.com/office/word/2006/wordml" mc:Ignorable="w14 w15 w16se w16cid w16 w16cex w16sdtdh w16sdtfl w16du wp14">
   <w:footnote w:type="separator" w:id="-1">
     <w:p>
       <w:r>
@@ -4348,7 +5453,7 @@
 </file>
 
 <file path=word/header1.xml><?xml version="1.0" encoding="utf-8"?>
-<w:hdr xmlns:wpc="http://schemas.microsoft.com/office/word/2010/wordprocessingCanvas" xmlns:cx="http://schemas.microsoft.com/office/drawing/2014/chartex" xmlns:mc="http://schemas.openxmlformats.org/markup-compatibility/2006" xmlns:o="urn:schemas-microsoft-com:office:office" xmlns:r="http://schemas.openxmlformats.org/officeDocument/2006/relationships" xmlns:m="http://schemas.openxmlformats.org/officeDocument/2006/math" xmlns:v="urn:schemas-microsoft-com:vml" xmlns:wp14="http://schemas.microsoft.com/office/word/2010/wordprocessingDrawing" xmlns:wp="http://schemas.openxmlformats.org/drawingml/2006/wordprocessingDrawing" xmlns:w10="urn:schemas-microsoft-com:office:word" xmlns:w="http://schemas.openxmlformats.org/wordprocessingml/2006/main" xmlns:w14="http://schemas.microsoft.com/office/word/2010/wordml" xmlns:w15="http://schemas.microsoft.com/office/word/2012/wordml" xmlns:w16se="http://schemas.microsoft.com/office/word/2015/wordml/symex" xmlns:wpg="http://schemas.microsoft.com/office/word/2010/wordprocessingGroup" xmlns:wpi="http://schemas.microsoft.com/office/word/2010/wordprocessingInk" xmlns:wne="http://schemas.microsoft.com/office/word/2006/wordml" xmlns:wps="http://schemas.microsoft.com/office/word/2010/wordprocessingShape" mc:Ignorable="w14 w15 w16se wp14">
+<w:hdr xmlns:wpc="http://schemas.microsoft.com/office/word/2010/wordprocessingCanvas" xmlns:cx="http://schemas.microsoft.com/office/drawing/2014/chartex" xmlns:cx1="http://schemas.microsoft.com/office/drawing/2015/9/8/chartex" xmlns:cx2="http://schemas.microsoft.com/office/drawing/2015/10/21/chartex" xmlns:cx3="http://schemas.microsoft.com/office/drawing/2016/5/9/chartex" xmlns:cx4="http://schemas.microsoft.com/office/drawing/2016/5/10/chartex" xmlns:cx5="http://schemas.microsoft.com/office/drawing/2016/5/11/chartex" xmlns:cx6="http://schemas.microsoft.com/office/drawing/2016/5/12/chartex" xmlns:cx7="http://schemas.microsoft.com/office/drawing/2016/5/13/chartex" xmlns:cx8="http://schemas.microsoft.com/office/drawing/2016/5/14/chartex" xmlns:mc="http://schemas.openxmlformats.org/markup-compatibility/2006" xmlns:m="http://schemas.openxmlformats.org/officeDocument/2006/math" xmlns:aink="http://schemas.microsoft.com/office/drawing/2016/ink" xmlns:am3d="http://schemas.microsoft.com/office/drawing/2017/model3d" xmlns:oel="http://schemas.microsoft.com/office/2019/extlst" xmlns:r="http://schemas.openxmlformats.org/officeDocument/2006/relationships" xmlns:wp14="http://schemas.microsoft.com/office/word/2010/wordprocessingDrawing" xmlns:wp="http://schemas.openxmlformats.org/drawingml/2006/wordprocessingDrawing" xmlns:wpg="http://schemas.microsoft.com/office/word/2010/wordprocessingGroup" xmlns:wpi="http://schemas.microsoft.com/office/word/2010/wordprocessingInk" xmlns:wps="http://schemas.microsoft.com/office/word/2010/wordprocessingShape" xmlns:o="urn:schemas-microsoft-com:office:office" xmlns:v="urn:schemas-microsoft-com:vml" xmlns:w10="urn:schemas-microsoft-com:office:word" xmlns:w="http://schemas.openxmlformats.org/wordprocessingml/2006/main" xmlns:w14="http://schemas.microsoft.com/office/word/2010/wordml" xmlns:w15="http://schemas.microsoft.com/office/word/2012/wordml" xmlns:w16cex="http://schemas.microsoft.com/office/word/2018/wordml/cex" xmlns:w16cid="http://schemas.microsoft.com/office/word/2016/wordml/cid" xmlns:w16="http://schemas.microsoft.com/office/word/2018/wordml" xmlns:w16sdtdh="http://schemas.microsoft.com/office/word/2020/wordml/sdtdatahash" xmlns:w16sdtfl="http://schemas.microsoft.com/office/word/2024/wordml/sdtformatlock" xmlns:w16se="http://schemas.microsoft.com/office/word/2015/wordml/symex" xmlns:w16du="http://schemas.microsoft.com/office/word/2023/wordml/word16du" xmlns:wne="http://schemas.microsoft.com/office/word/2006/wordml" mc:Ignorable="w14 w15 w16se w16cid w16 w16cex w16sdtdh w16sdtfl w16du wp14">
   <w:p>
     <w:pPr>
       <w:pStyle w:val="Header"/>
@@ -4387,7 +5492,7 @@
 </file>
 
 <file path=word/styles.xml><?xml version="1.0" encoding="utf-8"?>
-<w:styles xmlns:mc="http://schemas.openxmlformats.org/markup-compatibility/2006" xmlns:r="http://schemas.openxmlformats.org/officeDocument/2006/relationships" xmlns:w="http://schemas.openxmlformats.org/wordprocessingml/2006/main" xmlns:w14="http://schemas.microsoft.com/office/word/2010/wordml" xmlns:w15="http://schemas.microsoft.com/office/word/2012/wordml" xmlns:w16se="http://schemas.microsoft.com/office/word/2015/wordml/symex" mc:Ignorable="w14 w15 w16se">
+<w:styles xmlns:mc="http://schemas.openxmlformats.org/markup-compatibility/2006" xmlns:r="http://schemas.openxmlformats.org/officeDocument/2006/relationships" xmlns:w="http://schemas.openxmlformats.org/wordprocessingml/2006/main" xmlns:w14="http://schemas.microsoft.com/office/word/2010/wordml" xmlns:w15="http://schemas.microsoft.com/office/word/2012/wordml" xmlns:w16cex="http://schemas.microsoft.com/office/word/2018/wordml/cex" xmlns:w16cid="http://schemas.microsoft.com/office/word/2016/wordml/cid" xmlns:w16="http://schemas.microsoft.com/office/word/2018/wordml" xmlns:w16sdtdh="http://schemas.microsoft.com/office/word/2020/wordml/sdtdatahash" xmlns:w16sdtfl="http://schemas.microsoft.com/office/word/2024/wordml/sdtformatlock" xmlns:w16se="http://schemas.microsoft.com/office/word/2015/wordml/symex" xmlns:w16du="http://schemas.microsoft.com/office/word/2023/wordml/word16du" mc:Ignorable="w14 w15 w16se w16cid w16 w16cex w16sdtdh w16sdtfl w16du">
   <w:docDefaults>
     <w:rPrDefault>
       <w:rPr>
@@ -4397,7 +5502,7 @@
     </w:rPrDefault>
     <w:pPrDefault/>
   </w:docDefaults>
-  <w:latentStyles w:defLockedState="0" w:defUIPriority="0" w:defSemiHidden="0" w:defUnhideWhenUsed="0" w:defQFormat="0" w:count="371">
+  <w:latentStyles w:defLockedState="0" w:defUIPriority="0" w:defSemiHidden="0" w:defUnhideWhenUsed="0" w:defQFormat="0" w:count="376">
     <w:lsdException w:name="Normal" w:qFormat="1"/>
     <w:lsdException w:name="heading 1" w:qFormat="1"/>
     <w:lsdException w:name="heading 2" w:semiHidden="1" w:unhideWhenUsed="1" w:qFormat="1"/>
@@ -4677,6 +5782,11 @@
     <w:lsdException w:name="List Table 5 Dark Accent 6" w:uiPriority="50"/>
     <w:lsdException w:name="List Table 6 Colorful Accent 6" w:uiPriority="51"/>
     <w:lsdException w:name="List Table 7 Colorful Accent 6" w:uiPriority="52"/>
+    <w:lsdException w:name="Mention" w:semiHidden="1" w:uiPriority="99" w:unhideWhenUsed="1"/>
+    <w:lsdException w:name="Smart Hyperlink" w:semiHidden="1" w:uiPriority="99" w:unhideWhenUsed="1"/>
+    <w:lsdException w:name="Hashtag" w:semiHidden="1" w:uiPriority="99" w:unhideWhenUsed="1"/>
+    <w:lsdException w:name="Unresolved Mention" w:semiHidden="1" w:uiPriority="99" w:unhideWhenUsed="1"/>
+    <w:lsdException w:name="Smart Link" w:semiHidden="1" w:uiPriority="99" w:unhideWhenUsed="1"/>
   </w:latentStyles>
   <w:style w:type="paragraph" w:default="1" w:styleId="Normal">
     <w:name w:val="Normal"/>

</xml_diff>

<commit_message>
feat(settings): move Template Management to a dedicated modal and center the Save button
</commit_message>
<xml_diff>
--- a/public/VIS.docx
+++ b/public/VIS.docx
@@ -4523,15 +4523,6 @@
         </w:rPr>
         <w:t>{{vis_legal_position}}</w:t>
       </w:r>
-      <w:r>
-        <w:rPr>
-          <w:rFonts w:ascii="TH SarabunIT๙" w:hAnsi="TH SarabunIT๙" w:cs="TH SarabunIT๙" w:hint="cs"/>
-          <w:sz w:val="32"/>
-          <w:szCs w:val="32"/>
-          <w:cs/>
-        </w:rPr>
-        <w:t/>
-      </w:r>
     </w:p>
     <w:p>
       <w:pPr>
@@ -4720,7 +4711,7 @@
           <w:szCs w:val="32"/>
           <w:cs/>
         </w:rPr>
-        <w:t>นาย</w:t>
+        <w:t xml:space="preserve">   </w:t>
       </w:r>
       <w:r>
         <w:rPr>
@@ -4731,37 +4722,6 @@
         </w:rPr>
         <w:t>{{vis_chief_position}}</w:t>
       </w:r>
-      <w:proofErr w:type="spellStart"/>
-      <w:r>
-        <w:rPr>
-          <w:rFonts w:ascii="TH SarabunIT๙" w:hAnsi="TH SarabunIT๙" w:cs="TH SarabunIT๙" w:hint="cs"/>
-          <w:sz w:val="32"/>
-          <w:szCs w:val="32"/>
-          <w:cs/>
-        </w:rPr>
-        <w:t/>
-      </w:r>
-      <w:proofErr w:type="spellEnd"/>
-      <w:r>
-        <w:rPr>
-          <w:rFonts w:ascii="TH SarabunIT๙" w:hAnsi="TH SarabunIT๙" w:cs="TH SarabunIT๙" w:hint="cs"/>
-          <w:sz w:val="32"/>
-          <w:szCs w:val="32"/>
-          <w:cs/>
-        </w:rPr>
-        <w:t/>
-      </w:r>
-      <w:proofErr w:type="spellStart"/>
-      <w:r>
-        <w:rPr>
-          <w:rFonts w:ascii="TH SarabunIT๙" w:hAnsi="TH SarabunIT๙" w:cs="TH SarabunIT๙" w:hint="cs"/>
-          <w:sz w:val="32"/>
-          <w:szCs w:val="32"/>
-          <w:cs/>
-        </w:rPr>
-        <w:t/>
-      </w:r>
-      <w:proofErr w:type="spellEnd"/>
       <w:r>
         <w:rPr>
           <w:rFonts w:ascii="TH SarabunIT๙" w:hAnsi="TH SarabunIT๙" w:cs="TH SarabunIT๙" w:hint="cs"/>
@@ -4905,16 +4865,7 @@
           <w:szCs w:val="32"/>
           <w:cs/>
         </w:rPr>
-        <w:t>นาย</w:t>
-      </w:r>
-      <w:r>
-        <w:rPr>
-          <w:rFonts w:ascii="TH SarabunIT๙" w:hAnsi="TH SarabunIT๙" w:cs="TH SarabunIT๙" w:hint="cs"/>
-          <w:sz w:val="32"/>
-          <w:szCs w:val="32"/>
-          <w:cs/>
-        </w:rPr>
-        <w:t>{{vis_director_name}}</w:t>
+        <w:t>{{</w:t>
       </w:r>
       <w:proofErr w:type="spellStart"/>
       <w:r>
@@ -4924,7 +4875,7 @@
           <w:szCs w:val="32"/>
           <w:cs/>
         </w:rPr>
-        <w:t/>
+        <w:t>vis_director_name</w:t>
       </w:r>
       <w:proofErr w:type="spellEnd"/>
       <w:r>
@@ -4934,16 +4885,7 @@
           <w:szCs w:val="32"/>
           <w:cs/>
         </w:rPr>
-        <w:t xml:space="preserve"/>
-      </w:r>
-      <w:r>
-        <w:rPr>
-          <w:rFonts w:ascii="TH SarabunIT๙" w:hAnsi="TH SarabunIT๙" w:cs="TH SarabunIT๙" w:hint="cs"/>
-          <w:sz w:val="32"/>
-          <w:szCs w:val="32"/>
-          <w:cs/>
-        </w:rPr>
-        <w:t/>
+        <w:t>}}</w:t>
       </w:r>
       <w:r>
         <w:rPr>

</xml_diff>